<commit_message>
pilot -> study and 'the five participants' swept through KB and campaign backups
Scott applied the four live email changes in GHL; this mirrors them into the
campaigns/ backups and closes the KB half, which is what kept regenerating the
word. Two new KB Section 4 rules recorded rather than just the substitution:
never call it a pilot, since the study ran months after full production launch
and the word understates product maturity while adding nothing to a caveat that
'small, N=5, no control group' already carries in full; and write 'the five
participants' since dropping the article implies a larger cohort in which only
five responded.

Also swept 'pilot' out of the internal commentary in ten campaign files. The
only surviving uses are in WF-08's change log, where the word is the subject of
the rule being explained.

Co-Authored-By: Claude Opus 5 <noreply@anthropic.com>
</commit_message>
<xml_diff>
--- a/Enyrgy_Paperclip_Knowledge_Base.docx
+++ b/Enyrgy_Paperclip_Knowledge_Base.docx
@@ -2,7 +2,7 @@
 <file path=word/document.xml><?xml version="1.0" encoding="utf-8"?>
 <w:document xmlns:w="http://schemas.openxmlformats.org/wordprocessingml/2006/main" xmlns:m="http://schemas.openxmlformats.org/officeDocument/2006/math" xmlns:r="http://schemas.openxmlformats.org/officeDocument/2006/relationships" xmlns:o="urn:schemas-microsoft-com:office:office" xmlns:v="urn:schemas-microsoft-com:vml" xmlns:w10="urn:schemas-microsoft-com:office:word" xmlns:a="http://schemas.openxmlformats.org/drawingml/2006/main" xmlns:pic="http://schemas.openxmlformats.org/drawingml/2006/picture" xmlns:wp="http://schemas.openxmlformats.org/drawingml/2006/wordprocessingDrawing">
   <w:body>
-    <w:bookmarkStart w:id="33" w:name="enyrgy-knowledge-base-shared-agent-read"/>
+    <w:bookmarkStart w:id="25" w:name="enyrgy-knowledge-base-shared-agent-read"/>
     <w:p>
       <w:pPr>
         <w:pStyle w:val="Heading1"/>
@@ -44,7 +44,7 @@
         </w:pict>
       </w:r>
     </w:p>
-    <w:bookmarkStart w:id="17" w:name="company-snapshot"/>
+    <w:bookmarkStart w:id="9" w:name="company-snapshot"/>
     <w:p>
       <w:pPr>
         <w:pStyle w:val="Heading2"/>
@@ -70,7 +70,47 @@
         </w:numPr>
       </w:pPr>
       <w:r>
-        <w:t xml:space="preserve">Customers: 600+ (organic growth, zero paid advertising to date).</w:t>
+        <w:t xml:space="preserve">Users: 600+ (organic growth, zero paid advertising to date).</w:t>
+      </w:r>
+      <w:r>
+        <w:t xml:space="preserve"> </w:t>
+      </w:r>
+      <w:r>
+        <w:rPr>
+          <w:b/>
+          <w:bCs/>
+        </w:rPr>
+        <w:t xml:space="preserve">Say users, not customers.</w:t>
+      </w:r>
+      <w:r>
+        <w:t xml:space="preserve"> </w:t>
+      </w:r>
+      <w:r>
+        <w:t xml:space="preserve">A home unit supports up to six users, so the two are not interchangeable and</w:t>
+      </w:r>
+      <w:r>
+        <w:t xml:space="preserve"> </w:t>
+      </w:r>
+      <w:r>
+        <w:t xml:space="preserve">“600+ customers”</w:t>
+      </w:r>
+      <w:r>
+        <w:t xml:space="preserve"> </w:t>
+      </w:r>
+      <w:r>
+        <w:t xml:space="preserve">overstates unit sales. Use</w:t>
+      </w:r>
+      <w:r>
+        <w:t xml:space="preserve"> </w:t>
+      </w:r>
+      <w:r>
+        <w:t xml:space="preserve">“600+ users”</w:t>
+      </w:r>
+      <w:r>
+        <w:t xml:space="preserve"> </w:t>
+      </w:r>
+      <w:r>
+        <w:t xml:space="preserve">in all copy.</w:t>
       </w:r>
     </w:p>
     <w:p>
@@ -156,6 +196,22 @@
       <w:r>
         <w:t xml:space="preserve">Founder track record (verified, investor-facing): Scott Hansbury, 8 startups, 5 exits, $500M+ in value created. David Letourneau, scaled Alair Homes from 1 to 100+ locations, $750M+ in sales.</w:t>
       </w:r>
+      <w:r>
+        <w:t xml:space="preserve"> </w:t>
+      </w:r>
+      <w:r>
+        <w:rPr>
+          <w:b/>
+          <w:bCs/>
+        </w:rPr>
+        <w:t xml:space="preserve">Brian Cameron, CFO, is a former securities regulator</w:t>
+      </w:r>
+      <w:r>
+        <w:t xml:space="preserve"> </w:t>
+      </w:r>
+      <w:r>
+        <w:t xml:space="preserve">(confirmed by Scott, 2026-08-02). That background is a meaningful trust signal in investor conversations and is the kind of credential a serious investor may verify, so use it as stated and do not embellish it.</w:t>
+      </w:r>
     </w:p>
     <w:p>
       <w:pPr>
@@ -169,8 +225,8 @@
         <w:t xml:space="preserve">Active OEM partner: Lumanova (Luma D Light).</w:t>
       </w:r>
     </w:p>
-    <w:bookmarkEnd w:id="17"/>
-    <w:bookmarkStart w:id="18" w:name="product-the-triple-pathway-advantage"/>
+    <w:bookmarkEnd w:id="9"/>
+    <w:bookmarkStart w:id="10" w:name="product-the-triple-pathway-advantage"/>
     <w:p>
       <w:pPr>
         <w:pStyle w:val="Heading2"/>
@@ -279,7 +335,29 @@
         <w:pStyle w:val="BodyText"/>
       </w:pPr>
       <w:r>
-        <w:t xml:space="preserve">Sales anchor: no other solution delivers all three simultaneously. Supplements deliver Vitamin D only. Sunlight needs about 60x more time plus cancer risk. Red light is a different mechanism entirely (90 percent of Enyrgy customers use both). Enyrgy is a new category.</w:t>
+        <w:t xml:space="preserve">Sales anchor: nothing else delivers all three in 2 to 4 minutes with a dose calibrated to the individual and an automatic cutoff. Supplements deliver Vitamin D only. Sunlight needs about 60x more time plus cancer risk. Red light is a different mechanism entirely (90 percent of Enyrgy customers use both). Enyrgy is a new category.</w:t>
+      </w:r>
+      <w:r>
+        <w:t xml:space="preserve"> </w:t>
+      </w:r>
+      <w:r>
+        <w:rPr>
+          <w:b/>
+          <w:bCs/>
+        </w:rPr>
+        <w:t xml:space="preserve">Do not write the unqualified form</w:t>
+      </w:r>
+      <w:r>
+        <w:t xml:space="preserve"> </w:t>
+      </w:r>
+      <w:r>
+        <w:t xml:space="preserve">(</w:t>
+      </w:r>
+      <w:r>
+        <w:t xml:space="preserve">“no other solution delivers all three”</w:t>
+      </w:r>
+      <w:r>
+        <w:t xml:space="preserve">): a tanning bed does trigger all three pathways, badly and with no dosing control, so the unqualified claim is knockable down by one counterexample in front of the operators most likely to know it. The calibration-and-cutoff qualifier is what nothing else clears.</w:t>
       </w:r>
     </w:p>
     <w:p>
@@ -319,8 +397,8 @@
         <w:t xml:space="preserve">.</w:t>
       </w:r>
     </w:p>
-    <w:bookmarkEnd w:id="18"/>
-    <w:bookmarkStart w:id="19" w:name="pricing-and-unit-economics"/>
+    <w:bookmarkEnd w:id="10"/>
+    <w:bookmarkStart w:id="11" w:name="pricing-and-unit-economics"/>
     <w:p>
       <w:pPr>
         <w:pStyle w:val="Heading2"/>
@@ -376,6 +454,22 @@
       <w:r>
         <w:t xml:space="preserve">Referral: $150 off for the referee, $100 credit for the referrer (used in WF-07).</w:t>
       </w:r>
+      <w:r>
+        <w:t xml:space="preserve"> </w:t>
+      </w:r>
+      <w:r>
+        <w:rPr>
+          <w:b/>
+          <w:bCs/>
+        </w:rPr>
+        <w:t xml:space="preserve">Operated manually today:</w:t>
+      </w:r>
+      <w:r>
+        <w:t xml:space="preserve"> </w:t>
+      </w:r>
+      <w:r>
+        <w:t xml:space="preserve">a customer requests it and a custom Shopify discount code specific to that user is created by hand. Automation waits on the built-in loyalty program in the next app version, but the offer itself is live and can be quoted.</w:t>
+      </w:r>
     </w:p>
     <w:p>
       <w:pPr>
@@ -386,6 +480,31 @@
         </w:numPr>
       </w:pPr>
       <w:r>
+        <w:t xml:space="preserve">Monitored inbound address:</w:t>
+      </w:r>
+      <w:r>
+        <w:t xml:space="preserve"> </w:t>
+      </w:r>
+      <w:r>
+        <w:rPr>
+          <w:b/>
+          <w:bCs/>
+        </w:rPr>
+        <w:t xml:space="preserve">contact@enyrgy.com</w:t>
+      </w:r>
+      <w:r>
+        <w:t xml:space="preserve">, used across the funnel and monitored. Safe to give out.</w:t>
+      </w:r>
+    </w:p>
+    <w:p>
+      <w:pPr>
+        <w:pStyle w:val="Compact"/>
+        <w:numPr>
+          <w:ilvl w:val="0"/>
+          <w:numId w:val="1003"/>
+        </w:numPr>
+      </w:pPr>
+      <w:r>
         <w:t xml:space="preserve">Guarantee: 30-day money-back guarantee on the Consumer Unit. If it is not for you, return it within 30 days (return rate is under 1 percent, see Section 4).</w:t>
       </w:r>
     </w:p>
@@ -410,6 +529,71 @@
         </w:numPr>
       </w:pPr>
       <w:r>
+        <w:t xml:space="preserve">Commercial unit footprint: the device requires approximately</w:t>
+      </w:r>
+      <w:r>
+        <w:t xml:space="preserve"> </w:t>
+      </w:r>
+      <w:r>
+        <w:rPr>
+          <w:b/>
+          <w:bCs/>
+        </w:rPr>
+        <w:t xml:space="preserve">4 feet by 4 feet of floor space</w:t>
+      </w:r>
+      <w:r>
+        <w:t xml:space="preserve">. Space is usually the first practical objection a facility raises, so answer it directly. It does not need a dedicated room; facilities commonly site it in a hallway or an alcove where clients can take a session while waiting on another modality.</w:t>
+      </w:r>
+    </w:p>
+    <w:p>
+      <w:pPr>
+        <w:pStyle w:val="Compact"/>
+        <w:numPr>
+          <w:ilvl w:val="0"/>
+          <w:numId w:val="1003"/>
+        </w:numPr>
+      </w:pPr>
+      <w:r>
+        <w:t xml:space="preserve">Manufacturing and lead times: units are built in Phoenix in limited batches, which is why consumer copy refers to limited batches and to ship times running a few weeks.</w:t>
+      </w:r>
+      <w:r>
+        <w:t xml:space="preserve"> </w:t>
+      </w:r>
+      <w:r>
+        <w:rPr>
+          <w:b/>
+          <w:bCs/>
+        </w:rPr>
+        <w:t xml:space="preserve">Never quote a batch size or a specific lead time.</w:t>
+      </w:r>
+      <w:r>
+        <w:t xml:space="preserve"> </w:t>
+      </w:r>
+      <w:r>
+        <w:t xml:space="preserve">Both move with funding and production capacity, so any figure written down would keep being stated confidently after it stopped being true.</w:t>
+      </w:r>
+      <w:r>
+        <w:t xml:space="preserve"> </w:t>
+      </w:r>
+      <w:r>
+        <w:t xml:space="preserve">“Limited batches”</w:t>
+      </w:r>
+      <w:r>
+        <w:t xml:space="preserve"> </w:t>
+      </w:r>
+      <w:r>
+        <w:t xml:space="preserve">holds at any batch size and is the approved phrasing. Escalate lead-time questions to Scott.</w:t>
+      </w:r>
+    </w:p>
+    <w:p>
+      <w:pPr>
+        <w:pStyle w:val="Compact"/>
+        <w:numPr>
+          <w:ilvl w:val="0"/>
+          <w:numId w:val="1003"/>
+        </w:numPr>
+      </w:pPr>
+      <w:r>
         <w:t xml:space="preserve">OEM white-label (Lumanova / Luma D Light): same MSRP, wholesale arrangement.</w:t>
       </w:r>
     </w:p>
@@ -434,11 +618,105 @@
         </w:numPr>
       </w:pPr>
       <w:r>
-        <w:t xml:space="preserve">Commercial model: operators add Enyrgy as a $49-per-month modality add-on per client. Revenue scales with client count: 25 clients is $1,225 per month ($14,700 per year); 50 clients is $2,450 per month ($29,400 per year); 100 clients is $4,900 per month ($58,800 per year). Against the $8,950 unit cost, payback at 50 clients is under 4 months.</w:t>
-      </w:r>
-    </w:p>
-    <w:bookmarkEnd w:id="19"/>
-    <w:bookmarkStart w:id="21" w:name="clinical-and-credibility-data"/>
+        <w:t xml:space="preserve">Commercial model: operators charge clients</w:t>
+      </w:r>
+      <w:r>
+        <w:t xml:space="preserve"> </w:t>
+      </w:r>
+      <w:r>
+        <w:rPr>
+          <w:b/>
+          <w:bCs/>
+        </w:rPr>
+        <w:t xml:space="preserve">$49 to $125 per month</w:t>
+      </w:r>
+      <w:r>
+        <w:t xml:space="preserve"> </w:t>
+      </w:r>
+      <w:r>
+        <w:t xml:space="preserve">for Enyrgy access.</w:t>
+      </w:r>
+      <w:r>
+        <w:t xml:space="preserve"> </w:t>
+      </w:r>
+      <w:r>
+        <w:rPr>
+          <w:b/>
+          <w:bCs/>
+        </w:rPr>
+        <w:t xml:space="preserve">The rate depends on location and local clientele</w:t>
+      </w:r>
+      <w:r>
+        <w:t xml:space="preserve">, so quote the end of the range that matches the market rather than a single number. Standard markets support $49 to $75. Premium metro markets with affluent clientele support up to $125 (Orange County, California is a $125 market; the Center for New Medicine and Beyond Wellness in Costa Mesa are the reference points). Revenue scales with active client count:</w:t>
+      </w:r>
+    </w:p>
+    <w:p>
+      <w:pPr>
+        <w:pStyle w:val="Compact"/>
+        <w:numPr>
+          <w:ilvl w:val="1"/>
+          <w:numId w:val="1004"/>
+        </w:numPr>
+      </w:pPr>
+      <w:r>
+        <w:t xml:space="preserve">At $49 per month: 25 clients is $1,225 per month ($14,700 per year); 50 clients is $2,450 per month ($29,400 per year); 100 clients is $4,900 per month ($58,800 per year). Against the $8,950 unit cost, payback at 50 clients is under 4 months.</w:t>
+      </w:r>
+    </w:p>
+    <w:p>
+      <w:pPr>
+        <w:pStyle w:val="Compact"/>
+        <w:numPr>
+          <w:ilvl w:val="1"/>
+          <w:numId w:val="1004"/>
+        </w:numPr>
+      </w:pPr>
+      <w:r>
+        <w:t xml:space="preserve">At $125 per month: 25 clients is $3,125 per month ($37,500 per year); 50 clients is $6,250 per month ($75,000 per year); 100 clients is $12,500 per month ($150,000 per year). Payback at 50 clients is about 6 weeks.</w:t>
+      </w:r>
+    </w:p>
+    <w:p>
+      <w:pPr>
+        <w:pStyle w:val="Compact"/>
+        <w:numPr>
+          <w:ilvl w:val="0"/>
+          <w:numId w:val="1003"/>
+        </w:numPr>
+      </w:pPr>
+      <w:r>
+        <w:t xml:space="preserve">Commercial delivery model: the market is moving away from per-modality add-on pricing toward</w:t>
+      </w:r>
+      <w:r>
+        <w:t xml:space="preserve"> </w:t>
+      </w:r>
+      <w:r>
+        <w:rPr>
+          <w:b/>
+          <w:bCs/>
+        </w:rPr>
+        <w:t xml:space="preserve">membership models</w:t>
+      </w:r>
+      <w:r>
+        <w:t xml:space="preserve">. Enyrgy fits that shift and operators position it two ways: as a draw to bring in new members, and as an incentive to upgrade existing members into a higher tier. Where a facility runs</w:t>
+      </w:r>
+      <w:r>
+        <w:t xml:space="preserve"> </w:t>
+      </w:r>
+      <w:r>
+        <w:rPr>
+          <w:b/>
+          <w:bCs/>
+        </w:rPr>
+        <w:t xml:space="preserve">credit-based memberships</w:t>
+      </w:r>
+      <w:r>
+        <w:t xml:space="preserve"> </w:t>
+      </w:r>
+      <w:r>
+        <w:t xml:space="preserve">(members prepay for service credits), do NOT let Enyrgy be priced per session against credits: at 4 to 5 sessions a week the credit draw would consume an entire membership and crowd out the operator’s higher-margin services. Price it as a flat monthly add-on that sits outside credits, or include it in a top tier as the upgrade trigger. Enyrgy’s advantage in any membership model is that its marginal cost per session is near zero (no consumables, no practitioner, 2 to 4 minutes, app-run), unlike IV, NAD+, or practitioner-delivered services.</w:t>
+      </w:r>
+    </w:p>
+    <w:bookmarkEnd w:id="11"/>
+    <w:bookmarkStart w:id="13" w:name="clinical-and-credibility-data"/>
     <w:p>
       <w:pPr>
         <w:pStyle w:val="Heading2"/>
@@ -452,7 +730,7 @@
         <w:pStyle w:val="Compact"/>
         <w:numPr>
           <w:ilvl w:val="0"/>
-          <w:numId w:val="1004"/>
+          <w:numId w:val="1005"/>
         </w:numPr>
       </w:pPr>
       <w:r>
@@ -464,31 +742,141 @@
         <w:pStyle w:val="Compact"/>
         <w:numPr>
           <w:ilvl w:val="0"/>
-          <w:numId w:val="1004"/>
-        </w:numPr>
-      </w:pPr>
-      <w:r>
-        <w:t xml:space="preserve">Clinical study design and limitations (always cite results with this context): small pilot, N = 5 healthy adults, 4 to 6 sessions per week, 12 weeks, no control group. Larger trials are in development. When citing the 111 percent or 100-percent-optimal figures, present them as a small uncontrolled pilot, not as a large or controlled trial.</w:t>
-      </w:r>
-    </w:p>
-    <w:p>
-      <w:pPr>
-        <w:pStyle w:val="Compact"/>
-        <w:numPr>
-          <w:ilvl w:val="0"/>
-          <w:numId w:val="1004"/>
-        </w:numPr>
-      </w:pPr>
-      <w:r>
-        <w:t xml:space="preserve">Participant-level results (12-week pilot, about 5 sessions per week, skin types II to IV): P1 (Skin Type II) 38.4 to 86.0; P2 (III) 34.0 to 88.4; P3 (III) 37.0 to 78.0; P4 (IV) 47.0 to 88.7; P5 (III) 43.4 to 79.9 ng/mL. These reconcile to the reported averages (start 39.96, end 84.20). All started insufficient or borderline, all reached optimal, zero dropouts. Present with the same N = 5 pilot caveat as the averages.</w:t>
-      </w:r>
-    </w:p>
-    <w:p>
-      <w:pPr>
-        <w:pStyle w:val="Compact"/>
-        <w:numPr>
-          <w:ilvl w:val="0"/>
-          <w:numId w:val="1004"/>
+          <w:numId w:val="1005"/>
+        </w:numPr>
+      </w:pPr>
+      <w:r>
+        <w:t xml:space="preserve">Clinical study design and limitations (always cite results with this context): small study, N = 5 healthy adults, 4 to 6 sessions per week, 12 weeks, no control group. Larger trials are in development. When citing the 111 percent or 100-percent-optimal figures, present them as a small uncontrolled study, not as a large or controlled trial.</w:t>
+      </w:r>
+    </w:p>
+    <w:p>
+      <w:pPr>
+        <w:pStyle w:val="Compact"/>
+        <w:numPr>
+          <w:ilvl w:val="0"/>
+          <w:numId w:val="1005"/>
+        </w:numPr>
+      </w:pPr>
+      <w:r>
+        <w:rPr>
+          <w:b/>
+          <w:bCs/>
+        </w:rPr>
+        <w:t xml:space="preserve">Never call it a pilot.</w:t>
+      </w:r>
+      <w:r>
+        <w:t xml:space="preserve"> </w:t>
+      </w:r>
+      <w:r>
+        <w:t xml:space="preserve">Use study, small study, or observational cohort.</w:t>
+      </w:r>
+      <w:r>
+        <w:t xml:space="preserve"> </w:t>
+      </w:r>
+      <w:r>
+        <w:t xml:space="preserve">“Pilot”</w:t>
+      </w:r>
+      <w:r>
+        <w:t xml:space="preserve"> </w:t>
+      </w:r>
+      <w:r>
+        <w:t xml:space="preserve">implies a pre-launch or beta program, and this study ran months after Enyrgy went to full production in the market. The word understates the product’s maturity while doing nothing to improve the honesty of the caveat, which</w:t>
+      </w:r>
+      <w:r>
+        <w:t xml:space="preserve"> </w:t>
+      </w:r>
+      <w:r>
+        <w:t xml:space="preserve">“small, N = 5, no control group”</w:t>
+      </w:r>
+      <w:r>
+        <w:t xml:space="preserve"> </w:t>
+      </w:r>
+      <w:r>
+        <w:t xml:space="preserve">already carries in full.</w:t>
+      </w:r>
+    </w:p>
+    <w:p>
+      <w:pPr>
+        <w:pStyle w:val="Compact"/>
+        <w:numPr>
+          <w:ilvl w:val="0"/>
+          <w:numId w:val="1005"/>
+        </w:numPr>
+      </w:pPr>
+      <w:r>
+        <w:rPr>
+          <w:b/>
+          <w:bCs/>
+        </w:rPr>
+        <w:t xml:space="preserve">Write</w:t>
+      </w:r>
+      <w:r>
+        <w:rPr>
+          <w:b/>
+          <w:bCs/>
+        </w:rPr>
+        <w:t xml:space="preserve"> </w:t>
+      </w:r>
+      <w:r>
+        <w:rPr>
+          <w:b/>
+          <w:bCs/>
+        </w:rPr>
+        <w:t xml:space="preserve">“the five participants,”</w:t>
+      </w:r>
+      <w:r>
+        <w:rPr>
+          <w:b/>
+          <w:bCs/>
+        </w:rPr>
+        <w:t xml:space="preserve"> </w:t>
+      </w:r>
+      <w:r>
+        <w:rPr>
+          <w:b/>
+          <w:bCs/>
+        </w:rPr>
+        <w:t xml:space="preserve">not</w:t>
+      </w:r>
+      <w:r>
+        <w:rPr>
+          <w:b/>
+          <w:bCs/>
+        </w:rPr>
+        <w:t xml:space="preserve"> </w:t>
+      </w:r>
+      <w:r>
+        <w:rPr>
+          <w:b/>
+          <w:bCs/>
+        </w:rPr>
+        <w:t xml:space="preserve">“five participants.”</w:t>
+      </w:r>
+      <w:r>
+        <w:t xml:space="preserve"> </w:t>
+      </w:r>
+      <w:r>
+        <w:t xml:space="preserve">Without the article the sentence reads as though a larger cohort was studied and only five of them responded.</w:t>
+      </w:r>
+    </w:p>
+    <w:p>
+      <w:pPr>
+        <w:pStyle w:val="Compact"/>
+        <w:numPr>
+          <w:ilvl w:val="0"/>
+          <w:numId w:val="1005"/>
+        </w:numPr>
+      </w:pPr>
+      <w:r>
+        <w:t xml:space="preserve">Participant-level results (12-week study, about 5 sessions per week, skin types II to IV): P1 (Skin Type II) 38.4 to 86.0; P2 (III) 34.0 to 88.4; P3 (III) 37.0 to 78.0; P4 (IV) 47.0 to 88.7; P5 (III) 43.4 to 79.9 ng/mL. These reconcile to the reported averages (start 39.96, end 84.20). All started insufficient or borderline, all reached optimal, zero dropouts. Present with the same N = 5 caveat as the averages.</w:t>
+      </w:r>
+    </w:p>
+    <w:p>
+      <w:pPr>
+        <w:pStyle w:val="Compact"/>
+        <w:numPr>
+          <w:ilvl w:val="0"/>
+          <w:numId w:val="1005"/>
         </w:numPr>
       </w:pPr>
       <w:r>
@@ -500,7 +888,7 @@
         <w:pStyle w:val="Compact"/>
         <w:numPr>
           <w:ilvl w:val="0"/>
-          <w:numId w:val="1004"/>
+          <w:numId w:val="1005"/>
         </w:numPr>
       </w:pPr>
       <w:r>
@@ -524,14 +912,14 @@
         <w:pStyle w:val="Compact"/>
         <w:numPr>
           <w:ilvl w:val="0"/>
-          <w:numId w:val="1004"/>
+          <w:numId w:val="1005"/>
         </w:numPr>
       </w:pPr>
       <w:r>
         <w:t xml:space="preserve">Return rate under 1 percent, roughly 5 to 10x better than the industry average.</w:t>
       </w:r>
     </w:p>
-    <w:bookmarkStart w:id="20" w:name="X348ceaeaf7c4d682e7f80c59634d85e8a3d0daf"/>
+    <w:bookmarkStart w:id="12" w:name="X348ceaeaf7c4d682e7f80c59634d85e8a3d0daf"/>
     <w:p>
       <w:pPr>
         <w:pStyle w:val="Heading3"/>
@@ -670,9 +1058,9 @@
         <w:t xml:space="preserve">- Dosing reference used in the research: roughly 10 to 15 minutes of midday sun, three times per week.</w:t>
       </w:r>
     </w:p>
-    <w:bookmarkEnd w:id="20"/>
-    <w:bookmarkEnd w:id="21"/>
-    <w:bookmarkStart w:id="22" w:name="advisory-board"/>
+    <w:bookmarkEnd w:id="12"/>
+    <w:bookmarkEnd w:id="13"/>
+    <w:bookmarkStart w:id="14" w:name="advisory-board"/>
     <w:p>
       <w:pPr>
         <w:pStyle w:val="Heading2"/>
@@ -694,7 +1082,7 @@
         <w:pStyle w:val="Compact"/>
         <w:numPr>
           <w:ilvl w:val="0"/>
-          <w:numId w:val="1005"/>
+          <w:numId w:val="1006"/>
         </w:numPr>
       </w:pPr>
       <w:r>
@@ -708,15 +1096,28 @@
         <w:t xml:space="preserve"> </w:t>
       </w:r>
       <w:r>
-        <w:t xml:space="preserve">over 70,000 citations, widely regarded as the Godfather of Vitamin D Research. He has reviewed and endorsed the Enyrgy platform.</w:t>
-      </w:r>
-    </w:p>
-    <w:p>
-      <w:pPr>
-        <w:pStyle w:val="Compact"/>
-        <w:numPr>
-          <w:ilvl w:val="0"/>
-          <w:numId w:val="1005"/>
+        <w:t xml:space="preserve">over 70,000 citations, widely regarded as the Godfather of Vitamin D Research.</w:t>
+      </w:r>
+      <w:r>
+        <w:t xml:space="preserve"> </w:t>
+      </w:r>
+      <w:r>
+        <w:rPr>
+          <w:b/>
+          <w:bCs/>
+        </w:rPr>
+        <w:t xml:space="preserve">Over forty years on vitamin D research</w:t>
+      </w:r>
+      <w:r>
+        <w:t xml:space="preserve">, much of it on the difference between oral supplementation and UVB-synthesized vitamin D. He has reviewed and endorsed the Enyrgy platform.</w:t>
+      </w:r>
+    </w:p>
+    <w:p>
+      <w:pPr>
+        <w:pStyle w:val="Compact"/>
+        <w:numPr>
+          <w:ilvl w:val="0"/>
+          <w:numId w:val="1006"/>
         </w:numPr>
       </w:pPr>
       <w:r>
@@ -732,13 +1133,23 @@
       <w:r>
         <w:t xml:space="preserve">designed the MED protocol that powers every session; a leading researcher in UV therapy safety.</w:t>
       </w:r>
-    </w:p>
-    <w:p>
-      <w:pPr>
-        <w:pStyle w:val="Compact"/>
-        <w:numPr>
-          <w:ilvl w:val="0"/>
-          <w:numId w:val="1005"/>
+      <w:r>
+        <w:t xml:space="preserve"> </w:t>
+      </w:r>
+      <w:r>
+        <w:rPr>
+          <w:b/>
+          <w:bCs/>
+        </w:rPr>
+        <w:t xml:space="preserve">Over 100 peer-reviewed papers and two decades in the field.</w:t>
+      </w:r>
+    </w:p>
+    <w:p>
+      <w:pPr>
+        <w:pStyle w:val="Compact"/>
+        <w:numPr>
+          <w:ilvl w:val="0"/>
+          <w:numId w:val="1006"/>
         </w:numPr>
       </w:pPr>
       <w:r>
@@ -754,13 +1165,29 @@
       <w:r>
         <w:t xml:space="preserve">NASA UVB researcher and pioneer in phototherapy science.</w:t>
       </w:r>
+      <w:r>
+        <w:t xml:space="preserve"> </w:t>
+      </w:r>
+      <w:r>
+        <w:rPr>
+          <w:b/>
+          <w:bCs/>
+        </w:rPr>
+        <w:t xml:space="preserve">More than 350 peer-reviewed papers</w:t>
+      </w:r>
+      <w:r>
+        <w:t xml:space="preserve"> </w:t>
+      </w:r>
+      <w:r>
+        <w:t xml:space="preserve">on vitamin D, sunlight and health outcomes, using NASA UVB satellite data to map how sunlight exposure tracks with health across populations.</w:t>
+      </w:r>
     </w:p>
     <w:p>
       <w:pPr>
         <w:pStyle w:val="FirstParagraph"/>
       </w:pPr>
       <w:r>
-        <w:t xml:space="preserve">Do not paraphrase or embellish an advisor’s credentials beyond these approved bios. The short approved phrasing for objection handling remains</w:t>
+        <w:t xml:space="preserve">Do not paraphrase or embellish an advisor’s credentials beyond these approved bios. The publication and tenure figures were confirmed by Scott on 2026-08-02 and added because they were already live in WF-17 Long-Term Nurture touch 6, where the specificity is what makes the email work. Use the shorter form where space is tight; use the fuller form when the job is establishing that real researchers built the protocol. The short approved phrasing for objection handling remains</w:t>
       </w:r>
       <w:r>
         <w:t xml:space="preserve"> </w:t>
@@ -787,8 +1214,8 @@
         <w:t xml:space="preserve">the platform must have the advisor’s documented consent on file, per FTC endorsement rules.</w:t>
       </w:r>
     </w:p>
-    <w:bookmarkEnd w:id="22"/>
-    <w:bookmarkStart w:id="23" w:name="X2416962bbe798b4d07d64a796f71649a000b8ee"/>
+    <w:bookmarkEnd w:id="14"/>
+    <w:bookmarkStart w:id="15" w:name="X2416962bbe798b4d07d64a796f71649a000b8ee"/>
     <w:p>
       <w:pPr>
         <w:pStyle w:val="Heading2"/>
@@ -802,7 +1229,7 @@
         <w:pStyle w:val="Compact"/>
         <w:numPr>
           <w:ilvl w:val="0"/>
-          <w:numId w:val="1006"/>
+          <w:numId w:val="1007"/>
         </w:numPr>
       </w:pPr>
       <w:r>
@@ -814,7 +1241,7 @@
         <w:pStyle w:val="Compact"/>
         <w:numPr>
           <w:ilvl w:val="0"/>
-          <w:numId w:val="1006"/>
+          <w:numId w:val="1007"/>
         </w:numPr>
       </w:pPr>
       <w:r>
@@ -826,7 +1253,7 @@
         <w:pStyle w:val="Compact"/>
         <w:numPr>
           <w:ilvl w:val="0"/>
-          <w:numId w:val="1006"/>
+          <w:numId w:val="1007"/>
         </w:numPr>
       </w:pPr>
       <w:r>
@@ -838,7 +1265,7 @@
         <w:pStyle w:val="Compact"/>
         <w:numPr>
           <w:ilvl w:val="0"/>
-          <w:numId w:val="1006"/>
+          <w:numId w:val="1007"/>
         </w:numPr>
       </w:pPr>
       <w:r>
@@ -850,7 +1277,7 @@
         <w:pStyle w:val="Compact"/>
         <w:numPr>
           <w:ilvl w:val="0"/>
-          <w:numId w:val="1006"/>
+          <w:numId w:val="1007"/>
         </w:numPr>
       </w:pPr>
       <w:r>
@@ -862,7 +1289,7 @@
         <w:pStyle w:val="Compact"/>
         <w:numPr>
           <w:ilvl w:val="0"/>
-          <w:numId w:val="1006"/>
+          <w:numId w:val="1007"/>
         </w:numPr>
       </w:pPr>
       <w:r>
@@ -874,7 +1301,7 @@
         <w:pStyle w:val="Compact"/>
         <w:numPr>
           <w:ilvl w:val="0"/>
-          <w:numId w:val="1006"/>
+          <w:numId w:val="1007"/>
         </w:numPr>
       </w:pPr>
       <w:r>
@@ -886,7 +1313,7 @@
         <w:pStyle w:val="Compact"/>
         <w:numPr>
           <w:ilvl w:val="0"/>
-          <w:numId w:val="1006"/>
+          <w:numId w:val="1007"/>
         </w:numPr>
       </w:pPr>
       <w:r>
@@ -898,7 +1325,7 @@
         <w:pStyle w:val="Compact"/>
         <w:numPr>
           <w:ilvl w:val="0"/>
-          <w:numId w:val="1006"/>
+          <w:numId w:val="1007"/>
         </w:numPr>
       </w:pPr>
       <w:r>
@@ -910,19 +1337,19 @@
         <w:pStyle w:val="Compact"/>
         <w:numPr>
           <w:ilvl w:val="0"/>
-          <w:numId w:val="1006"/>
-        </w:numPr>
-      </w:pPr>
-      <w:r>
-        <w:t xml:space="preserve">600+ customers, 5 countries, zero paid ads.</w:t>
-      </w:r>
-    </w:p>
-    <w:p>
-      <w:pPr>
-        <w:pStyle w:val="Compact"/>
-        <w:numPr>
-          <w:ilvl w:val="0"/>
-          <w:numId w:val="1006"/>
+          <w:numId w:val="1007"/>
+        </w:numPr>
+      </w:pPr>
+      <w:r>
+        <w:t xml:space="preserve">600+ users, 5 countries, zero paid ads.</w:t>
+      </w:r>
+    </w:p>
+    <w:p>
+      <w:pPr>
+        <w:pStyle w:val="Compact"/>
+        <w:numPr>
+          <w:ilvl w:val="0"/>
+          <w:numId w:val="1007"/>
         </w:numPr>
       </w:pPr>
       <w:r>
@@ -934,7 +1361,7 @@
         <w:pStyle w:val="Compact"/>
         <w:numPr>
           <w:ilvl w:val="0"/>
-          <w:numId w:val="1006"/>
+          <w:numId w:val="1007"/>
         </w:numPr>
       </w:pPr>
       <w:r>
@@ -946,7 +1373,7 @@
         <w:pStyle w:val="Compact"/>
         <w:numPr>
           <w:ilvl w:val="0"/>
-          <w:numId w:val="1006"/>
+          <w:numId w:val="1007"/>
         </w:numPr>
       </w:pPr>
       <w:r>
@@ -958,7 +1385,7 @@
         <w:pStyle w:val="Compact"/>
         <w:numPr>
           <w:ilvl w:val="0"/>
-          <w:numId w:val="1006"/>
+          <w:numId w:val="1007"/>
         </w:numPr>
       </w:pPr>
       <w:r>
@@ -970,15 +1397,15 @@
         <w:pStyle w:val="Compact"/>
         <w:numPr>
           <w:ilvl w:val="0"/>
-          <w:numId w:val="1006"/>
+          <w:numId w:val="1007"/>
         </w:numPr>
       </w:pPr>
       <w:r>
         <w:t xml:space="preserve">Sunlight. Evolved.</w:t>
       </w:r>
     </w:p>
-    <w:bookmarkEnd w:id="23"/>
-    <w:bookmarkStart w:id="24" w:name="objection-scripts-voiced"/>
+    <w:bookmarkEnd w:id="15"/>
+    <w:bookmarkStart w:id="16" w:name="objection-scripts-voiced"/>
     <w:p>
       <w:pPr>
         <w:pStyle w:val="Heading2"/>
@@ -1004,7 +1431,7 @@
         <w:pStyle w:val="Compact"/>
         <w:numPr>
           <w:ilvl w:val="0"/>
-          <w:numId w:val="1007"/>
+          <w:numId w:val="1008"/>
         </w:numPr>
       </w:pPr>
       <w:r>
@@ -1016,19 +1443,19 @@
         <w:pStyle w:val="Compact"/>
         <w:numPr>
           <w:ilvl w:val="0"/>
-          <w:numId w:val="1007"/>
-        </w:numPr>
-      </w:pPr>
-      <w:r>
-        <w:t xml:space="preserve">I already take supplements. Supplements are one lane, Vitamin D, and only if your body responds to it. In the trials, about one in four participants were low responders to vitamin D supplementation. Enyrgy opens all three lanes, Vitamin D, nitric oxide, and serotonin, in 2 to 4 minutes.</w:t>
-      </w:r>
-    </w:p>
-    <w:p>
-      <w:pPr>
-        <w:pStyle w:val="Compact"/>
-        <w:numPr>
-          <w:ilvl w:val="0"/>
-          <w:numId w:val="1007"/>
+          <w:numId w:val="1008"/>
+        </w:numPr>
+      </w:pPr>
+      <w:r>
+        <w:t xml:space="preserve">I already take supplements. Supplements are one lane, Vitamin D, and only if your body responds to it. In research clinical trials, about one in four participants were low responders to vitamin D supplementation. Enyrgy opens all three lanes, Vitamin D, nitric oxide, and serotonin, in 2 to 4 minutes.</w:t>
+      </w:r>
+    </w:p>
+    <w:p>
+      <w:pPr>
+        <w:pStyle w:val="Compact"/>
+        <w:numPr>
+          <w:ilvl w:val="0"/>
+          <w:numId w:val="1008"/>
         </w:numPr>
       </w:pPr>
       <w:r>
@@ -1040,7 +1467,7 @@
         <w:pStyle w:val="Compact"/>
         <w:numPr>
           <w:ilvl w:val="0"/>
-          <w:numId w:val="1007"/>
+          <w:numId w:val="1008"/>
         </w:numPr>
       </w:pPr>
       <w:r>
@@ -1052,7 +1479,7 @@
         <w:pStyle w:val="Compact"/>
         <w:numPr>
           <w:ilvl w:val="0"/>
-          <w:numId w:val="1007"/>
+          <w:numId w:val="1008"/>
         </w:numPr>
       </w:pPr>
       <w:r>
@@ -1076,7 +1503,7 @@
         <w:pStyle w:val="Compact"/>
         <w:numPr>
           <w:ilvl w:val="0"/>
-          <w:numId w:val="1008"/>
+          <w:numId w:val="1009"/>
         </w:numPr>
       </w:pPr>
       <w:r>
@@ -1088,19 +1515,19 @@
         <w:pStyle w:val="Compact"/>
         <w:numPr>
           <w:ilvl w:val="0"/>
-          <w:numId w:val="1008"/>
-        </w:numPr>
-      </w:pPr>
-      <w:r>
-        <w:t xml:space="preserve">Would clients pay? Vitamin D runs low in 77 percent of indoor adults, so the demand is already in your book. Operators are charging $49 to $75 a month for it.</w:t>
-      </w:r>
-    </w:p>
-    <w:p>
-      <w:pPr>
-        <w:pStyle w:val="Compact"/>
-        <w:numPr>
-          <w:ilvl w:val="0"/>
-          <w:numId w:val="1008"/>
+          <w:numId w:val="1009"/>
+        </w:numPr>
+      </w:pPr>
+      <w:r>
+        <w:t xml:space="preserve">Would clients pay? Vitamin D runs low in 77 percent of indoor adults, so the demand is already in your book. Operators are charging $49 to $125 a month for it, depending on their market and clientele.</w:t>
+      </w:r>
+    </w:p>
+    <w:p>
+      <w:pPr>
+        <w:pStyle w:val="Compact"/>
+        <w:numPr>
+          <w:ilvl w:val="0"/>
+          <w:numId w:val="1009"/>
         </w:numPr>
       </w:pPr>
       <w:r>
@@ -1124,7 +1551,7 @@
         <w:pStyle w:val="Compact"/>
         <w:numPr>
           <w:ilvl w:val="0"/>
-          <w:numId w:val="1009"/>
+          <w:numId w:val="1010"/>
         </w:numPr>
       </w:pPr>
       <w:r>
@@ -1136,7 +1563,7 @@
         <w:pStyle w:val="Compact"/>
         <w:numPr>
           <w:ilvl w:val="0"/>
-          <w:numId w:val="1009"/>
+          <w:numId w:val="1010"/>
         </w:numPr>
       </w:pPr>
       <w:r>
@@ -1148,15 +1575,15 @@
         <w:pStyle w:val="Compact"/>
         <w:numPr>
           <w:ilvl w:val="0"/>
-          <w:numId w:val="1009"/>
+          <w:numId w:val="1010"/>
         </w:numPr>
       </w:pPr>
       <w:r>
         <w:t xml:space="preserve">What is the exit? A strategic acquisition in the $100 to 150M range within 5 years. Natural buyers look like Philips, Apple Health, Peloton, AG1, or LVMH.</w:t>
       </w:r>
     </w:p>
-    <w:bookmarkEnd w:id="24"/>
-    <w:bookmarkStart w:id="25" w:name="claim-precision-corrected"/>
+    <w:bookmarkEnd w:id="16"/>
+    <w:bookmarkStart w:id="17" w:name="claim-precision-corrected"/>
     <w:p>
       <w:pPr>
         <w:pStyle w:val="Heading2"/>
@@ -1192,13 +1619,34 @@
           <w:b/>
           <w:bCs/>
         </w:rPr>
-        <w:t xml:space="preserve">“in these trials, about one in four participants were low responders to vitamin D supplementation”</w:t>
-      </w:r>
-      <w:r>
-        <w:t xml:space="preserve"> </w:t>
-      </w:r>
-      <w:r>
-        <w:t xml:space="preserve">(Carlberg, VitDmet and VitDbol trials, Nutrients 2023, 15(15):3382). Never say</w:t>
+        <w:t xml:space="preserve">“in research clinical trials, about one in four participants were low responders to vitamin D supplementation”</w:t>
+      </w:r>
+      <w:r>
+        <w:t xml:space="preserve">. Do NOT write</w:t>
+      </w:r>
+      <w:r>
+        <w:t xml:space="preserve"> </w:t>
+      </w:r>
+      <w:r>
+        <w:t xml:space="preserve">“in these trials”</w:t>
+      </w:r>
+      <w:r>
+        <w:t xml:space="preserve"> </w:t>
+      </w:r>
+      <w:r>
+        <w:t xml:space="preserve">or</w:t>
+      </w:r>
+      <w:r>
+        <w:t xml:space="preserve"> </w:t>
+      </w:r>
+      <w:r>
+        <w:t xml:space="preserve">“in the trials”</w:t>
+      </w:r>
+      <w:r>
+        <w:t xml:space="preserve"> </w:t>
+      </w:r>
+      <w:r>
+        <w:t xml:space="preserve">in copy: lifted out of this KB the citation stays behind and the phrase reads as though Enyrgy ran them. Investor-facing copy may name them as the Carlberg trials. (Carlberg, VitDmet and VitDbol trials, Nutrients 2023, 15(15):3382). Never say</w:t>
       </w:r>
       <w:r>
         <w:t xml:space="preserve"> </w:t>
@@ -1231,8 +1679,8 @@
         <w:t xml:space="preserve">This supersedes the older phrasing in Implementation Guide v3.9 Section 22 (Session 8 correction). Every claim must be exactly as verifiable as stated: no superlatives, no inflation, no unverifiable characterizations.</w:t>
       </w:r>
     </w:p>
-    <w:bookmarkEnd w:id="25"/>
-    <w:bookmarkStart w:id="26" w:name="brand-constants-locked"/>
+    <w:bookmarkEnd w:id="17"/>
+    <w:bookmarkStart w:id="18" w:name="brand-constants-locked"/>
     <w:p>
       <w:pPr>
         <w:pStyle w:val="Heading2"/>
@@ -1246,7 +1694,7 @@
         <w:pStyle w:val="Compact"/>
         <w:numPr>
           <w:ilvl w:val="0"/>
-          <w:numId w:val="1010"/>
+          <w:numId w:val="1011"/>
         </w:numPr>
       </w:pPr>
       <w:r>
@@ -1258,7 +1706,7 @@
         <w:pStyle w:val="Compact"/>
         <w:numPr>
           <w:ilvl w:val="0"/>
-          <w:numId w:val="1010"/>
+          <w:numId w:val="1011"/>
         </w:numPr>
       </w:pPr>
       <w:r>
@@ -1270,7 +1718,7 @@
         <w:pStyle w:val="Compact"/>
         <w:numPr>
           <w:ilvl w:val="0"/>
-          <w:numId w:val="1010"/>
+          <w:numId w:val="1011"/>
         </w:numPr>
       </w:pPr>
       <w:r>
@@ -1282,7 +1730,7 @@
         <w:pStyle w:val="Compact"/>
         <w:numPr>
           <w:ilvl w:val="0"/>
-          <w:numId w:val="1010"/>
+          <w:numId w:val="1011"/>
         </w:numPr>
       </w:pPr>
       <w:r>
@@ -1300,7 +1748,7 @@
         <w:pStyle w:val="Compact"/>
         <w:numPr>
           <w:ilvl w:val="0"/>
-          <w:numId w:val="1010"/>
+          <w:numId w:val="1011"/>
         </w:numPr>
       </w:pPr>
       <w:r>
@@ -1312,15 +1760,15 @@
         <w:pStyle w:val="Compact"/>
         <w:numPr>
           <w:ilvl w:val="0"/>
-          <w:numId w:val="1010"/>
+          <w:numId w:val="1011"/>
         </w:numPr>
       </w:pPr>
       <w:r>
         <w:t xml:space="preserve">Age minimum for all audiences: 18.</w:t>
       </w:r>
     </w:p>
-    <w:bookmarkEnd w:id="26"/>
-    <w:bookmarkStart w:id="27" w:name="X29fd5ad5ba47d28e168b82835ce779321403abb"/>
+    <w:bookmarkEnd w:id="18"/>
+    <w:bookmarkStart w:id="19" w:name="X29fd5ad5ba47d28e168b82835ce779321403abb"/>
     <w:p>
       <w:pPr>
         <w:pStyle w:val="Heading2"/>
@@ -1349,8 +1797,8 @@
         <w:t xml:space="preserve">is false framing and must never be used.</w:t>
       </w:r>
     </w:p>
-    <w:bookmarkEnd w:id="27"/>
-    <w:bookmarkStart w:id="28" w:name="prohibited-words-compliance"/>
+    <w:bookmarkEnd w:id="19"/>
+    <w:bookmarkStart w:id="20" w:name="prohibited-words-compliance"/>
     <w:p>
       <w:pPr>
         <w:pStyle w:val="Heading2"/>
@@ -1367,8 +1815,8 @@
         <w:t xml:space="preserve">Never use in client-facing content: treat, cure, diagnose, disease, prescription, FDA-approved, medical treatment, heal, fix, medication, illness, clinical diagnosis, therapeutic treatment. Review all client-facing content against the January 2026 FDA Guidelines for Wellness Products before use. Enyrgy is a wellness device, not medical, and makes no medical claims.</w:t>
       </w:r>
     </w:p>
-    <w:bookmarkEnd w:id="28"/>
-    <w:bookmarkStart w:id="29" w:name="X3b2ee3b0312272551b8ea402502772f453681e0"/>
+    <w:bookmarkEnd w:id="20"/>
+    <w:bookmarkStart w:id="21" w:name="X3b2ee3b0312272551b8ea402502772f453681e0"/>
     <w:p>
       <w:pPr>
         <w:pStyle w:val="Heading2"/>
@@ -1421,8 +1869,8 @@
         <w:t xml:space="preserve">The prohibited-words scan runs before every email, SMS, and voicemail across all funnels. All investor materials must be attorney-approved before they load into the KB or GHL. The PPM is attorney-approved and may be sent after the intro meeting.</w:t>
       </w:r>
     </w:p>
-    <w:bookmarkEnd w:id="29"/>
-    <w:bookmarkStart w:id="30" w:name="investor-offering-details"/>
+    <w:bookmarkEnd w:id="21"/>
+    <w:bookmarkStart w:id="22" w:name="investor-offering-details"/>
     <w:p>
       <w:pPr>
         <w:pStyle w:val="Heading2"/>
@@ -1436,7 +1884,7 @@
         <w:pStyle w:val="Compact"/>
         <w:numPr>
           <w:ilvl w:val="0"/>
-          <w:numId w:val="1011"/>
+          <w:numId w:val="1012"/>
         </w:numPr>
       </w:pPr>
       <w:r>
@@ -1448,7 +1896,7 @@
         <w:pStyle w:val="Compact"/>
         <w:numPr>
           <w:ilvl w:val="0"/>
-          <w:numId w:val="1011"/>
+          <w:numId w:val="1012"/>
         </w:numPr>
       </w:pPr>
       <w:r>
@@ -1460,7 +1908,7 @@
         <w:pStyle w:val="Compact"/>
         <w:numPr>
           <w:ilvl w:val="0"/>
-          <w:numId w:val="1011"/>
+          <w:numId w:val="1012"/>
         </w:numPr>
       </w:pPr>
       <w:r>
@@ -1472,7 +1920,7 @@
         <w:pStyle w:val="Compact"/>
         <w:numPr>
           <w:ilvl w:val="0"/>
-          <w:numId w:val="1011"/>
+          <w:numId w:val="1012"/>
         </w:numPr>
       </w:pPr>
       <w:r>
@@ -1484,7 +1932,7 @@
         <w:pStyle w:val="Compact"/>
         <w:numPr>
           <w:ilvl w:val="0"/>
-          <w:numId w:val="1011"/>
+          <w:numId w:val="1012"/>
         </w:numPr>
       </w:pPr>
       <w:r>
@@ -1496,7 +1944,7 @@
         <w:pStyle w:val="Compact"/>
         <w:numPr>
           <w:ilvl w:val="0"/>
-          <w:numId w:val="1011"/>
+          <w:numId w:val="1012"/>
         </w:numPr>
       </w:pPr>
       <w:r>
@@ -1518,8 +1966,8 @@
         <w:t xml:space="preserve">= Yes is confirmed (see the rule in section 12).</w:t>
       </w:r>
     </w:p>
-    <w:bookmarkEnd w:id="30"/>
-    <w:bookmarkStart w:id="31" w:name="oem-partner-lumanova-luma-d-light"/>
+    <w:bookmarkEnd w:id="22"/>
+    <w:bookmarkStart w:id="23" w:name="oem-partner-lumanova-luma-d-light"/>
     <w:p>
       <w:pPr>
         <w:pStyle w:val="Heading2"/>
@@ -1533,7 +1981,7 @@
         <w:pStyle w:val="Compact"/>
         <w:numPr>
           <w:ilvl w:val="0"/>
-          <w:numId w:val="1012"/>
+          <w:numId w:val="1013"/>
         </w:numPr>
       </w:pPr>
       <w:r>
@@ -1545,7 +1993,7 @@
         <w:pStyle w:val="Compact"/>
         <w:numPr>
           <w:ilvl w:val="0"/>
-          <w:numId w:val="1012"/>
+          <w:numId w:val="1013"/>
         </w:numPr>
       </w:pPr>
       <w:r>
@@ -1557,7 +2005,7 @@
         <w:pStyle w:val="Compact"/>
         <w:numPr>
           <w:ilvl w:val="0"/>
-          <w:numId w:val="1012"/>
+          <w:numId w:val="1013"/>
         </w:numPr>
       </w:pPr>
       <w:r>
@@ -1611,7 +2059,7 @@
         <w:pStyle w:val="Compact"/>
         <w:numPr>
           <w:ilvl w:val="0"/>
-          <w:numId w:val="1012"/>
+          <w:numId w:val="1013"/>
         </w:numPr>
       </w:pPr>
       <w:r>
@@ -1623,15 +2071,15 @@
         <w:pStyle w:val="Compact"/>
         <w:numPr>
           <w:ilvl w:val="0"/>
-          <w:numId w:val="1012"/>
+          <w:numId w:val="1013"/>
         </w:numPr>
       </w:pPr>
       <w:r>
         <w:t xml:space="preserve">Partner arrangements offered: Enyrgy offers both white-label (a partner sells the platform under their own brand, as Lumanova does) and distribution (a partner distributes to other facilities). Both are real, offered arrangements. Specific terms are handled per deal; confirm with the CEO before quoting figures.</w:t>
       </w:r>
     </w:p>
-    <w:bookmarkEnd w:id="31"/>
-    <w:bookmarkStart w:id="32" w:name="key-reference-facts-quick-lookup"/>
+    <w:bookmarkEnd w:id="23"/>
+    <w:bookmarkStart w:id="24" w:name="key-reference-facts-quick-lookup"/>
     <w:p>
       <w:pPr>
         <w:pStyle w:val="Heading2"/>
@@ -1642,6 +2090,14 @@
     </w:p>
     <w:tbl>
       <w:tblPr>
+        <w:tblBorders>
+          <w:top w:val="single" w:sz="6" w:space="0" w:color="AAAAAA"/>
+          <w:left w:val="single" w:sz="6" w:space="0" w:color="AAAAAA"/>
+          <w:bottom w:val="single" w:sz="6" w:space="0" w:color="AAAAAA"/>
+          <w:right w:val="single" w:sz="6" w:space="0" w:color="AAAAAA"/>
+          <w:insideH w:val="single" w:sz="6" w:space="0" w:color="AAAAAA"/>
+          <w:insideV w:val="single" w:sz="6" w:space="0" w:color="AAAAAA"/>
+        </w:tblBorders>
         <w:tblStyle w:val="Table"/>
         <w:tblW w:type="pct" w:w="5000"/>
         <w:tblLayout w:type="fixed"/>
@@ -2009,7 +2465,7 @@
               <w:pStyle w:val="Compact"/>
             </w:pPr>
             <w:r>
-              <w:t xml:space="preserve">$49/month modality add-on per client; payback under 4 months at 50 clients</w:t>
+              <w:t xml:space="preserve">$49 to $125/month per client, set by location and clientele; payback under 4 months at 50 clients at $49, about 6 weeks at $125</w:t>
             </w:r>
           </w:p>
         </w:tc>
@@ -2034,13 +2490,12 @@
         <w:t xml:space="preserve">CONFIDENTIAL - Enyrgy Inc - 5115 N 27th Ave, Bld 66, Phoenix, AZ 85017 - enyrgy.com - Sunlight. Evolved.</w:t>
       </w:r>
     </w:p>
-    <w:bookmarkEnd w:id="32"/>
-    <w:bookmarkEnd w:id="33"/>
+    <w:bookmarkEnd w:id="24"/>
+    <w:bookmarkEnd w:id="25"/>
     <w:sectPr>
-      <w:pgSz w:h="15840" w:orient="portrait" w:w="12240"/>
-      <w:pgMar w:bottom="1440" w:footer="708" w:gutter="0" w:header="708" w:left="1440" w:right="1440" w:top="1440"/>
-      <w:pgNumType/>
-      <w:docGrid w:linePitch="360"/>
+      <w:footnotePr>
+        <w:numRestart w:val="eachSect"/>
+      </w:footnotePr>
     </w:sectPr>
   </w:body>
 </w:document>
@@ -2050,28 +2505,6 @@
 <w:comments xmlns:w="http://schemas.openxmlformats.org/wordprocessingml/2006/main" xmlns:m="http://schemas.openxmlformats.org/officeDocument/2006/math" xmlns:r="http://schemas.openxmlformats.org/officeDocument/2006/relationships" xmlns:o="urn:schemas-microsoft-com:office:office" xmlns:v="urn:schemas-microsoft-com:vml" xmlns:w10="urn:schemas-microsoft-com:office:word" xmlns:a="http://schemas.openxmlformats.org/drawingml/2006/main" xmlns:pic="http://schemas.openxmlformats.org/drawingml/2006/picture" xmlns:wp="http://schemas.openxmlformats.org/drawingml/2006/wordprocessingDrawing"/>
 </file>
 
-<file path=word/footer1.xml><?xml version="1.0" encoding="utf-8"?>
-<w:ftr xmlns:wpc="http://schemas.microsoft.com/office/word/2010/wordprocessingCanvas" xmlns:mc="http://schemas.openxmlformats.org/markup-compatibility/2006" xmlns:o="urn:schemas-microsoft-com:office:office" xmlns:r="http://schemas.openxmlformats.org/officeDocument/2006/relationships" xmlns:m="http://schemas.openxmlformats.org/officeDocument/2006/math" xmlns:v="urn:schemas-microsoft-com:vml" xmlns:wp14="http://schemas.microsoft.com/office/word/2010/wordprocessingDrawing" xmlns:wp="http://schemas.openxmlformats.org/drawingml/2006/wordprocessingDrawing" xmlns:w10="urn:schemas-microsoft-com:office:word" xmlns:w="http://schemas.openxmlformats.org/wordprocessingml/2006/main" xmlns:w14="http://schemas.microsoft.com/office/word/2010/wordml" xmlns:w15="http://schemas.microsoft.com/office/word/2012/wordml" xmlns:wpg="http://schemas.microsoft.com/office/word/2010/wordprocessingGroup" xmlns:wpi="http://schemas.microsoft.com/office/word/2010/wordprocessingInk" xmlns:wne="http://schemas.microsoft.com/office/word/2006/wordml" xmlns:wps="http://schemas.microsoft.com/office/word/2010/wordprocessingShape">
-  <w:p>
-    <w:pPr>
-      <w:jc w:val="center"/>
-    </w:pPr>
-    <w:r>
-      <w:rPr>
-        <w:rFonts w:ascii="Montserrat" w:cs="Montserrat" w:eastAsia="Montserrat" w:hAnsi="Montserrat"/>
-        <w:color w:val="6B6B66"/>
-        <w:sz w:val="16"/>
-        <w:szCs w:val="16"/>
-      </w:rPr>
-      <w:fldChar w:fldCharType="begin"/>
-      <w:instrText xml:space="preserve">PAGE</w:instrText>
-      <w:fldChar w:fldCharType="separate"/>
-      <w:fldChar w:fldCharType="end"/>
-    </w:r>
-  </w:p>
-</w:ftr>
-</file>
-
 <file path=word/footnotes.xml><?xml version="1.0" encoding="utf-8"?>
 <w:footnotes xmlns:w="http://schemas.openxmlformats.org/wordprocessingml/2006/main" xmlns:m="http://schemas.openxmlformats.org/officeDocument/2006/math" xmlns:r="http://schemas.openxmlformats.org/officeDocument/2006/relationships" xmlns:o="urn:schemas-microsoft-com:office:office" xmlns:v="urn:schemas-microsoft-com:vml" xmlns:w10="urn:schemas-microsoft-com:office:word" xmlns:a="http://schemas.openxmlformats.org/drawingml/2006/main" xmlns:pic="http://schemas.openxmlformats.org/drawingml/2006/picture" xmlns:wp="http://schemas.openxmlformats.org/drawingml/2006/wordprocessingDrawing">
   <w:footnote w:type="continuationSeparator" w:id="0">
@@ -2091,117 +2524,8 @@
 </w:footnotes>
 </file>
 
-<file path=word/header1.xml><?xml version="1.0" encoding="utf-8"?>
-<w:hdr xmlns:wpc="http://schemas.microsoft.com/office/word/2010/wordprocessingCanvas" xmlns:mc="http://schemas.openxmlformats.org/markup-compatibility/2006" xmlns:o="urn:schemas-microsoft-com:office:office" xmlns:r="http://schemas.openxmlformats.org/officeDocument/2006/relationships" xmlns:m="http://schemas.openxmlformats.org/officeDocument/2006/math" xmlns:v="urn:schemas-microsoft-com:vml" xmlns:wp14="http://schemas.microsoft.com/office/word/2010/wordprocessingDrawing" xmlns:wp="http://schemas.openxmlformats.org/drawingml/2006/wordprocessingDrawing" xmlns:w10="urn:schemas-microsoft-com:office:word" xmlns:w="http://schemas.openxmlformats.org/wordprocessingml/2006/main" xmlns:w14="http://schemas.microsoft.com/office/word/2010/wordml" xmlns:w15="http://schemas.microsoft.com/office/word/2012/wordml" xmlns:wpg="http://schemas.microsoft.com/office/word/2010/wordprocessingGroup" xmlns:wpi="http://schemas.microsoft.com/office/word/2010/wordprocessingInk" xmlns:wne="http://schemas.microsoft.com/office/word/2006/wordml" xmlns:wps="http://schemas.microsoft.com/office/word/2010/wordprocessingShape" xmlns:cx="http://schemas.microsoft.com/office/drawing/2014/chartex" xmlns:cx1="http://schemas.microsoft.com/office/drawing/2015/9/8/chartex" xmlns:cx2="http://schemas.microsoft.com/office/drawing/2015/10/21/chartex" xmlns:cx3="http://schemas.microsoft.com/office/drawing/2016/5/9/chartex" xmlns:cx4="http://schemas.microsoft.com/office/drawing/2016/5/10/chartex" xmlns:cx5="http://schemas.microsoft.com/office/drawing/2016/5/11/chartex" xmlns:cx6="http://schemas.microsoft.com/office/drawing/2016/5/12/chartex" xmlns:cx7="http://schemas.microsoft.com/office/drawing/2016/5/13/chartex" xmlns:cx8="http://schemas.microsoft.com/office/drawing/2016/5/14/chartex" xmlns:w16cid="http://schemas.microsoft.com/office/word/2016/wordml/cid" xmlns:w16se="http://schemas.microsoft.com/office/word/2015/wordml/symex">
-  <w:p>
-    <w:pPr>
-      <w:pBdr>
-        <w:bottom w:val="single" w:color="E64C38" w:sz="8"/>
-      </w:pBdr>
-      <w:spacing w:after="120"/>
-      <w:jc w:val="left"/>
-    </w:pPr>
-    <w:r>
-      <w:rPr>
-        <w:rFonts w:ascii="Montserrat" w:cs="Montserrat" w:eastAsia="Montserrat" w:hAnsi="Montserrat"/>
-        <w:b/>
-        <w:bCs/>
-        <w:color w:val="E64C38"/>
-        <w:sz w:val="16"/>
-        <w:szCs w:val="16"/>
-      </w:rPr>
-      <w:t xml:space="preserve">Enyrgy Knowledge Base</w:t>
-    </w:r>
-  </w:p>
-</w:hdr>
-</file>
-
 <file path=word/numbering.xml><?xml version="1.0" encoding="utf-8"?>
-<w:numbering xmlns:m="http://schemas.openxmlformats.org/officeDocument/2006/math" xmlns:mc="http://schemas.openxmlformats.org/markup-compatibility/2006" xmlns:o="urn:schemas-microsoft-com:office:office" xmlns:r="http://schemas.openxmlformats.org/officeDocument/2006/relationships" xmlns:v="urn:schemas-microsoft-com:vml" xmlns:w="http://schemas.openxmlformats.org/wordprocessingml/2006/main" xmlns:w10="urn:schemas-microsoft-com:office:word" xmlns:w14="http://schemas.microsoft.com/office/word/2010/wordml" xmlns:w15="http://schemas.microsoft.com/office/word/2012/wordml" xmlns:wne="http://schemas.microsoft.com/office/word/2006/wordml" xmlns:wp="http://schemas.openxmlformats.org/drawingml/2006/wordprocessingDrawing" xmlns:wp14="http://schemas.microsoft.com/office/word/2010/wordprocessingDrawing" xmlns:wpc="http://schemas.microsoft.com/office/word/2010/wordprocessingCanvas" xmlns:wpg="http://schemas.microsoft.com/office/word/2010/wordprocessingGroup" xmlns:wpi="http://schemas.microsoft.com/office/word/2010/wordprocessingInk" xmlns:wps="http://schemas.microsoft.com/office/word/2010/wordprocessingShape" mc:Ignorable="w14 w15 wp14">
-  <w:abstractNum w15:restartNumberingAfterBreak="0" w:abstractNumId="1">
-    <w:multiLevelType w:val="hybridMultilevel"/>
-    <w:lvl w15:tentative="1" w:ilvl="0">
-      <w:start w:val="1"/>
-      <w:numFmt w:val="bullet"/>
-      <w:lvlText w:val="●"/>
-      <w:lvlJc w:val="left"/>
-      <w:pPr>
-        <w:ind w:hanging="360" w:left="720"/>
-      </w:pPr>
-    </w:lvl>
-    <w:lvl w15:tentative="1" w:ilvl="1">
-      <w:start w:val="1"/>
-      <w:numFmt w:val="bullet"/>
-      <w:lvlText w:val="○"/>
-      <w:lvlJc w:val="left"/>
-      <w:pPr>
-        <w:ind w:hanging="360" w:left="1440"/>
-      </w:pPr>
-    </w:lvl>
-    <w:lvl w15:tentative="1" w:ilvl="2">
-      <w:start w:val="1"/>
-      <w:numFmt w:val="bullet"/>
-      <w:lvlText w:val="■"/>
-      <w:lvlJc w:val="left"/>
-      <w:pPr>
-        <w:ind w:hanging="360" w:left="2160"/>
-      </w:pPr>
-    </w:lvl>
-    <w:lvl w15:tentative="1" w:ilvl="3">
-      <w:start w:val="1"/>
-      <w:numFmt w:val="bullet"/>
-      <w:lvlText w:val="●"/>
-      <w:lvlJc w:val="left"/>
-      <w:pPr>
-        <w:ind w:hanging="360" w:left="2880"/>
-      </w:pPr>
-    </w:lvl>
-    <w:lvl w15:tentative="1" w:ilvl="4">
-      <w:start w:val="1"/>
-      <w:numFmt w:val="bullet"/>
-      <w:lvlText w:val="○"/>
-      <w:lvlJc w:val="left"/>
-      <w:pPr>
-        <w:ind w:hanging="360" w:left="3600"/>
-      </w:pPr>
-    </w:lvl>
-    <w:lvl w15:tentative="1" w:ilvl="5">
-      <w:start w:val="1"/>
-      <w:numFmt w:val="bullet"/>
-      <w:lvlText w:val="■"/>
-      <w:lvlJc w:val="left"/>
-      <w:pPr>
-        <w:ind w:hanging="360" w:left="4320"/>
-      </w:pPr>
-    </w:lvl>
-    <w:lvl w15:tentative="1" w:ilvl="6">
-      <w:start w:val="1"/>
-      <w:numFmt w:val="bullet"/>
-      <w:lvlText w:val="●"/>
-      <w:lvlJc w:val="left"/>
-      <w:pPr>
-        <w:ind w:hanging="360" w:left="5040"/>
-      </w:pPr>
-    </w:lvl>
-    <w:lvl w15:tentative="1" w:ilvl="7">
-      <w:start w:val="1"/>
-      <w:numFmt w:val="bullet"/>
-      <w:lvlText w:val="●"/>
-      <w:lvlJc w:val="left"/>
-      <w:pPr>
-        <w:ind w:hanging="360" w:left="5760"/>
-      </w:pPr>
-    </w:lvl>
-    <w:lvl w15:tentative="1" w:ilvl="8">
-      <w:start w:val="1"/>
-      <w:numFmt w:val="bullet"/>
-      <w:lvlText w:val="●"/>
-      <w:lvlJc w:val="left"/>
-      <w:pPr>
-        <w:ind w:hanging="360" w:left="6480"/>
-      </w:pPr>
-    </w:lvl>
-  </w:abstractNum>
+<w:numbering xmlns:w="http://schemas.openxmlformats.org/wordprocessingml/2006/main">
   <w:abstractNum w:abstractNumId="990">
     <w:nsid w:val="0000A990"/>
     <w:multiLevelType w:val="multilevel"/>
@@ -2381,12 +2705,6 @@
       </w:rPr>
     </w:lvl>
   </w:abstractNum>
-  <w:num w:numId="1">
-    <w:abstractNumId w:val="1"/>
-    <w:lvlOverride w:ilvl="0">
-      <w:startOverride w:val="1"/>
-    </w:lvlOverride>
-  </w:num>
   <w:num w:numId="1000">
     <w:abstractNumId w:val="990"/>
   </w:num>
@@ -2426,439 +2744,667 @@
   <w:num w:numId="1012">
     <w:abstractNumId w:val="991"/>
   </w:num>
+  <w:num w:numId="1013">
+    <w:abstractNumId w:val="991"/>
+  </w:num>
 </w:numbering>
 </file>
 
 <file path=word/styles.xml><?xml version="1.0" encoding="utf-8"?>
-<w:styles xmlns:mc="http://schemas.openxmlformats.org/markup-compatibility/2006" xmlns:r="http://schemas.openxmlformats.org/officeDocument/2006/relationships" xmlns:w="http://schemas.openxmlformats.org/wordprocessingml/2006/main" xmlns:w14="http://schemas.microsoft.com/office/word/2010/wordml" xmlns:w15="http://schemas.microsoft.com/office/word/2012/wordml" mc:Ignorable="w14 w15">
+<w:styles xmlns:r="http://schemas.openxmlformats.org/officeDocument/2006/relationships" xmlns:w="http://schemas.openxmlformats.org/wordprocessingml/2006/main">
   <w:docDefaults>
     <w:rPrDefault>
       <w:rPr>
-        <w:rFonts w:ascii="Montserrat" w:cs="Montserrat" w:eastAsia="Montserrat" w:hAnsi="Montserrat"/>
-        <w:color w:val="1A1A1A"/>
-        <w:sz w:val="21"/>
-        <w:szCs w:val="21"/>
+        <w:rFonts w:asciiTheme="minorHAnsi" w:cstheme="minorBidi" w:eastAsiaTheme="minorEastAsia" w:hAnsiTheme="minorHAnsi"/>
+        <w:sz w:val="24"/>
+        <w:szCs w:val="24"/>
+        <w:lang w:bidi="ar-SA" w:eastAsia="zh-CN" w:val="en-US"/>
       </w:rPr>
     </w:rPrDefault>
-    <w:pPrDefault/>
+    <w:pPrDefault>
+      <w:pPr>
+        <w:spacing w:after="200"/>
+      </w:pPr>
+    </w:pPrDefault>
   </w:docDefaults>
+  <w:latentStyles w:count="276" w:defLockedState="0" w:defQFormat="0" w:defSemiHidden="0" w:defUIPriority="0" w:defUnhideWhenUsed="0"/>
+  <w:style w:default="1" w:styleId="Normal" w:type="paragraph">
+    <w:name w:val="Normal"/>
+    <w:qFormat/>
+  </w:style>
+  <w:style w:styleId="BodyText" w:type="paragraph">
+    <w:name w:val="Body Text"/>
+    <w:basedOn w:val="Normal"/>
+    <w:link w:val="BodyTextChar"/>
+    <w:qFormat/>
+    <w:pPr>
+      <w:spacing w:after="180" w:before="180"/>
+    </w:pPr>
+  </w:style>
+  <w:style w:customStyle="1" w:styleId="FirstParagraph" w:type="paragraph">
+    <w:name w:val="First Paragraph"/>
+    <w:basedOn w:val="BodyText"/>
+    <w:next w:val="BodyText"/>
+    <w:qFormat/>
+  </w:style>
+  <w:style w:customStyle="1" w:styleId="Compact" w:type="paragraph">
+    <w:name w:val="Compact"/>
+    <w:basedOn w:val="BodyText"/>
+    <w:qFormat/>
+    <w:pPr>
+      <w:spacing w:after="36" w:before="36"/>
+    </w:pPr>
+  </w:style>
   <w:style w:styleId="Title" w:type="paragraph">
     <w:name w:val="Title"/>
     <w:basedOn w:val="Normal"/>
-    <w:next w:val="Normal"/>
+    <w:next w:val="BodyText"/>
+    <w:link w:val="TitleChar"/>
+    <w:uiPriority w:val="10"/>
     <w:qFormat/>
-    <w:rPr>
+    <w:rsid w:val="00A10FD9"/>
+    <w:pPr>
+      <w:spacing w:after="80" w:line="240" w:lineRule="auto"/>
+      <w:contextualSpacing/>
+      <w:jc w:val="center"/>
+    </w:pPr>
+    <w:rPr>
+      <w:rFonts w:asciiTheme="majorHAnsi" w:cstheme="majorBidi" w:eastAsiaTheme="majorEastAsia" w:hAnsiTheme="majorHAnsi"/>
       <w:sz w:val="56"/>
       <w:szCs w:val="56"/>
     </w:rPr>
   </w:style>
+  <w:style w:customStyle="1" w:styleId="TitleChar" w:type="character">
+    <w:name w:val="Title Char"/>
+    <w:basedOn w:val="DefaultParagraphFont"/>
+    <w:link w:val="Title"/>
+    <w:uiPriority w:val="10"/>
+    <w:rsid w:val="00A10FD9"/>
+    <w:rPr>
+      <w:rFonts w:asciiTheme="majorHAnsi" w:cstheme="majorBidi" w:eastAsiaTheme="majorEastAsia" w:hAnsiTheme="majorHAnsi"/>
+      <w:sz w:val="56"/>
+      <w:szCs w:val="56"/>
+    </w:rPr>
+  </w:style>
+  <w:style w:styleId="Subtitle" w:type="paragraph">
+    <w:name w:val="Subtitle"/>
+    <w:basedOn w:val="Title"/>
+    <w:next w:val="BodyText"/>
+    <w:link w:val="SubtitleChar"/>
+    <w:uiPriority w:val="11"/>
+    <w:qFormat/>
+    <w:rsid w:val="00A10FD9"/>
+    <w:pPr>
+      <w:numPr>
+        <w:ilvl w:val="1"/>
+      </w:numPr>
+    </w:pPr>
+    <w:rPr>
+      <w:rFonts w:cstheme="majorBidi" w:eastAsiaTheme="majorEastAsia"/>
+      <w:spacing w:val="15"/>
+      <w:sz w:val="28"/>
+      <w:szCs w:val="28"/>
+    </w:rPr>
+  </w:style>
+  <w:style w:customStyle="1" w:styleId="SubtitleChar" w:type="character">
+    <w:name w:val="Subtitle Char"/>
+    <w:basedOn w:val="DefaultParagraphFont"/>
+    <w:link w:val="Subtitle"/>
+    <w:uiPriority w:val="11"/>
+    <w:rsid w:val="00A10FD9"/>
+    <w:rPr>
+      <w:rFonts w:cstheme="majorBidi" w:eastAsiaTheme="majorEastAsia"/>
+      <w:color w:themeColor="text1" w:themeTint="A6" w:val="595959"/>
+      <w:spacing w:val="15"/>
+      <w:sz w:val="28"/>
+      <w:szCs w:val="28"/>
+    </w:rPr>
+  </w:style>
+  <w:style w:customStyle="1" w:styleId="Author" w:type="paragraph">
+    <w:name w:val="Author"/>
+    <w:basedOn w:val="Title"/>
+    <w:next w:val="BodyText"/>
+    <w:qFormat/>
+    <w:pPr>
+      <w:keepNext/>
+      <w:keepLines/>
+    </w:pPr>
+    <w:rPr>
+      <w:sz w:val="24"/>
+      <w:szCs w:val="24"/>
+    </w:rPr>
+  </w:style>
+  <w:style w:styleId="Date" w:type="paragraph">
+    <w:name w:val="Date"/>
+    <w:basedOn w:val="Title"/>
+    <w:next w:val="BodyText"/>
+    <w:qFormat/>
+    <w:pPr>
+      <w:keepNext/>
+      <w:keepLines/>
+    </w:pPr>
+    <w:rPr>
+      <w:sz w:val="24"/>
+      <w:szCs w:val="24"/>
+    </w:rPr>
+  </w:style>
+  <w:style w:customStyle="1" w:styleId="AbstractTitle" w:type="paragraph">
+    <w:name w:val="Abstract Title"/>
+    <w:basedOn w:val="Normal"/>
+    <w:next w:val="Abstract"/>
+    <w:qFormat/>
+    <w:pPr>
+      <w:keepNext/>
+      <w:keepLines/>
+      <w:spacing w:after="0" w:before="300"/>
+      <w:jc w:val="center"/>
+    </w:pPr>
+    <w:rPr>
+      <w:b/>
+      <w:sz w:val="20"/>
+      <w:szCs w:val="20"/>
+    </w:rPr>
+  </w:style>
+  <w:style w:customStyle="1" w:styleId="Abstract" w:type="paragraph">
+    <w:name w:val="Abstract"/>
+    <w:basedOn w:val="Normal"/>
+    <w:next w:val="BodyText"/>
+    <w:qFormat/>
+    <w:pPr>
+      <w:keepNext/>
+      <w:keepLines/>
+      <w:spacing w:after="300" w:before="100"/>
+    </w:pPr>
+    <w:rPr>
+      <w:sz w:val="20"/>
+      <w:szCs w:val="20"/>
+    </w:rPr>
+  </w:style>
+  <w:style w:styleId="Bibliography" w:type="paragraph">
+    <w:name w:val="Bibliography"/>
+    <w:basedOn w:val="Normal"/>
+    <w:next w:val="Bibliography"/>
+    <w:qFormat/>
+    <w:pPr/>
+    <w:rPr/>
+  </w:style>
   <w:style w:styleId="Heading1" w:type="paragraph">
-    <w:name w:val="Heading 1"/>
+    <w:name w:val="heading 1"/>
     <w:basedOn w:val="Normal"/>
-    <w:next w:val="Normal"/>
+    <w:next w:val="BodyText"/>
+    <w:link w:val="Heading1Char"/>
+    <w:uiPriority w:val="9"/>
     <w:qFormat/>
-    <w:rPr>
-      <w:color w:val="2E74B5"/>
+    <w:rsid w:val="00A10FD9"/>
+    <w:pPr>
+      <w:keepNext/>
+      <w:keepLines/>
+      <w:spacing w:after="80" w:before="360"/>
+      <w:outlineLvl w:val="0"/>
+    </w:pPr>
+    <w:rPr>
+      <w:rFonts w:asciiTheme="majorHAnsi" w:cstheme="majorBidi" w:eastAsiaTheme="majorEastAsia" w:hAnsiTheme="majorHAnsi"/>
+      <w:color w:themeColor="accent1" w:themeShade="BF" w:val="0F4761"/>
+      <w:sz w:val="40"/>
+      <w:szCs w:val="40"/>
+    </w:rPr>
+  </w:style>
+  <w:style w:styleId="Heading2" w:type="paragraph">
+    <w:name w:val="heading 2"/>
+    <w:basedOn w:val="Normal"/>
+    <w:next w:val="BodyText"/>
+    <w:link w:val="Heading2Char"/>
+    <w:uiPriority w:val="9"/>
+    <w:semiHidden/>
+    <w:unhideWhenUsed/>
+    <w:qFormat/>
+    <w:rsid w:val="00A10FD9"/>
+    <w:pPr>
+      <w:keepNext/>
+      <w:keepLines/>
+      <w:spacing w:after="80" w:before="160"/>
+      <w:outlineLvl w:val="1"/>
+    </w:pPr>
+    <w:rPr>
+      <w:rFonts w:asciiTheme="majorHAnsi" w:cstheme="majorBidi" w:eastAsiaTheme="majorEastAsia" w:hAnsiTheme="majorHAnsi"/>
+      <w:color w:themeColor="accent1" w:themeShade="BF" w:val="0F4761"/>
       <w:sz w:val="32"/>
       <w:szCs w:val="32"/>
     </w:rPr>
   </w:style>
-  <w:style w:styleId="Heading2" w:type="paragraph">
-    <w:name w:val="Heading 2"/>
+  <w:style w:styleId="Heading3" w:type="paragraph">
+    <w:name w:val="heading 3"/>
     <w:basedOn w:val="Normal"/>
-    <w:next w:val="Normal"/>
+    <w:next w:val="BodyText"/>
+    <w:link w:val="Heading3Char"/>
+    <w:uiPriority w:val="9"/>
+    <w:semiHidden/>
+    <w:unhideWhenUsed/>
     <w:qFormat/>
-    <w:rPr>
-      <w:color w:val="2E74B5"/>
-      <w:sz w:val="26"/>
-      <w:szCs w:val="26"/>
-    </w:rPr>
-  </w:style>
-  <w:style w:styleId="Heading3" w:type="paragraph">
-    <w:name w:val="Heading 3"/>
+    <w:rsid w:val="00A10FD9"/>
+    <w:pPr>
+      <w:keepNext/>
+      <w:keepLines/>
+      <w:spacing w:after="80" w:before="160"/>
+      <w:outlineLvl w:val="2"/>
+    </w:pPr>
+    <w:rPr>
+      <w:rFonts w:cstheme="majorBidi" w:eastAsiaTheme="majorEastAsia"/>
+      <w:color w:themeColor="accent1" w:themeShade="BF" w:val="0F4761"/>
+      <w:sz w:val="28"/>
+      <w:szCs w:val="28"/>
+    </w:rPr>
+  </w:style>
+  <w:style w:styleId="Heading4" w:type="paragraph">
+    <w:name w:val="heading 4"/>
     <w:basedOn w:val="Normal"/>
-    <w:next w:val="Normal"/>
+    <w:next w:val="BodyText"/>
+    <w:link w:val="Heading4Char"/>
+    <w:uiPriority w:val="9"/>
+    <w:semiHidden/>
+    <w:unhideWhenUsed/>
     <w:qFormat/>
-    <w:rPr>
-      <w:color w:val="1F4D78"/>
-      <w:sz w:val="24"/>
-      <w:szCs w:val="24"/>
-    </w:rPr>
-  </w:style>
-  <w:style w:styleId="Heading4" w:type="paragraph">
-    <w:name w:val="Heading 4"/>
-    <w:basedOn w:val="Normal"/>
-    <w:next w:val="Normal"/>
-    <w:qFormat/>
-    <w:rPr>
+    <w:rsid w:val="00A10FD9"/>
+    <w:pPr>
+      <w:keepNext/>
+      <w:keepLines/>
+      <w:spacing w:after="40" w:before="80"/>
+      <w:outlineLvl w:val="3"/>
+    </w:pPr>
+    <w:rPr>
+      <w:rFonts w:cstheme="majorBidi" w:eastAsiaTheme="majorEastAsia"/>
       <w:i/>
       <w:iCs/>
-      <w:color w:val="2E74B5"/>
+      <w:color w:themeColor="accent1" w:themeShade="BF" w:val="0F4761"/>
     </w:rPr>
   </w:style>
   <w:style w:styleId="Heading5" w:type="paragraph">
-    <w:name w:val="Heading 5"/>
+    <w:name w:val="heading 5"/>
     <w:basedOn w:val="Normal"/>
-    <w:next w:val="Normal"/>
+    <w:next w:val="BodyText"/>
+    <w:link w:val="Heading5Char"/>
+    <w:uiPriority w:val="9"/>
+    <w:semiHidden/>
+    <w:unhideWhenUsed/>
     <w:qFormat/>
-    <w:rPr>
-      <w:color w:val="2E74B5"/>
+    <w:rsid w:val="00A10FD9"/>
+    <w:pPr>
+      <w:keepNext/>
+      <w:keepLines/>
+      <w:spacing w:after="40" w:before="80"/>
+      <w:outlineLvl w:val="4"/>
+    </w:pPr>
+    <w:rPr>
+      <w:rFonts w:cstheme="majorBidi" w:eastAsiaTheme="majorEastAsia"/>
+      <w:color w:themeColor="accent1" w:themeShade="BF" w:val="0F4761"/>
     </w:rPr>
   </w:style>
   <w:style w:styleId="Heading6" w:type="paragraph">
-    <w:name w:val="Heading 6"/>
+    <w:name w:val="heading 6"/>
     <w:basedOn w:val="Normal"/>
-    <w:next w:val="Normal"/>
+    <w:next w:val="BodyText"/>
+    <w:link w:val="Heading6Char"/>
+    <w:uiPriority w:val="9"/>
+    <w:semiHidden/>
+    <w:unhideWhenUsed/>
     <w:qFormat/>
-    <w:rPr>
-      <w:color w:val="1F4D78"/>
-    </w:rPr>
-  </w:style>
-  <w:style w:styleId="Strong" w:type="paragraph">
-    <w:name w:val="Strong"/>
+    <w:rsid w:val="00A10FD9"/>
+    <w:pPr>
+      <w:keepNext/>
+      <w:keepLines/>
+      <w:spacing w:after="0" w:before="40"/>
+      <w:outlineLvl w:val="5"/>
+    </w:pPr>
+    <w:rPr>
+      <w:rFonts w:cstheme="majorBidi" w:eastAsiaTheme="majorEastAsia"/>
+      <w:i/>
+      <w:iCs/>
+      <w:color w:themeColor="text1" w:themeTint="A6" w:val="595959"/>
+    </w:rPr>
+  </w:style>
+  <w:style w:styleId="Heading7" w:type="paragraph">
+    <w:name w:val="heading 7"/>
     <w:basedOn w:val="Normal"/>
-    <w:next w:val="Normal"/>
+    <w:next w:val="BodyText"/>
+    <w:link w:val="Heading7Char"/>
+    <w:uiPriority w:val="9"/>
+    <w:semiHidden/>
+    <w:unhideWhenUsed/>
     <w:qFormat/>
+    <w:rsid w:val="00A10FD9"/>
+    <w:pPr>
+      <w:keepNext/>
+      <w:keepLines/>
+      <w:spacing w:after="0" w:before="40"/>
+      <w:outlineLvl w:val="6"/>
+    </w:pPr>
+    <w:rPr>
+      <w:rFonts w:cstheme="majorBidi" w:eastAsiaTheme="majorEastAsia"/>
+      <w:color w:themeColor="text1" w:themeTint="A6" w:val="595959"/>
+    </w:rPr>
+  </w:style>
+  <w:style w:styleId="Heading8" w:type="paragraph">
+    <w:name w:val="heading 8"/>
+    <w:basedOn w:val="Normal"/>
+    <w:next w:val="BodyText"/>
+    <w:link w:val="Heading8Char"/>
+    <w:uiPriority w:val="9"/>
+    <w:semiHidden/>
+    <w:unhideWhenUsed/>
+    <w:qFormat/>
+    <w:rsid w:val="00A10FD9"/>
+    <w:pPr>
+      <w:keepNext/>
+      <w:keepLines/>
+      <w:spacing w:after="0"/>
+      <w:outlineLvl w:val="7"/>
+    </w:pPr>
+    <w:rPr>
+      <w:rFonts w:cstheme="majorBidi" w:eastAsiaTheme="majorEastAsia"/>
+      <w:i/>
+      <w:iCs/>
+      <w:color w:themeColor="text1" w:themeTint="D8" w:val="272727"/>
+    </w:rPr>
+  </w:style>
+  <w:style w:styleId="Heading9" w:type="paragraph">
+    <w:name w:val="heading 9"/>
+    <w:basedOn w:val="Normal"/>
+    <w:next w:val="BodyText"/>
+    <w:link w:val="Heading9Char"/>
+    <w:uiPriority w:val="9"/>
+    <w:semiHidden/>
+    <w:unhideWhenUsed/>
+    <w:qFormat/>
+    <w:rsid w:val="00A10FD9"/>
+    <w:pPr>
+      <w:keepNext/>
+      <w:keepLines/>
+      <w:spacing w:after="0"/>
+      <w:outlineLvl w:val="8"/>
+    </w:pPr>
+    <w:rPr>
+      <w:rFonts w:cstheme="majorBidi" w:eastAsiaTheme="majorEastAsia"/>
+      <w:color w:themeColor="text1" w:themeTint="D8" w:val="272727"/>
+    </w:rPr>
+  </w:style>
+  <w:style w:customStyle="1" w:styleId="Heading1Char" w:type="character">
+    <w:name w:val="Heading 1 Char"/>
+    <w:basedOn w:val="DefaultParagraphFont"/>
+    <w:link w:val="Heading1"/>
+    <w:uiPriority w:val="9"/>
+    <w:rsid w:val="00A10FD9"/>
+    <w:rPr>
+      <w:rFonts w:asciiTheme="majorHAnsi" w:cstheme="majorBidi" w:eastAsiaTheme="majorEastAsia" w:hAnsiTheme="majorHAnsi"/>
+      <w:color w:themeColor="accent1" w:themeShade="BF" w:val="0F4761"/>
+      <w:sz w:val="40"/>
+      <w:szCs w:val="40"/>
+    </w:rPr>
+  </w:style>
+  <w:style w:customStyle="1" w:styleId="Heading2Char" w:type="character">
+    <w:name w:val="Heading 2 Char"/>
+    <w:basedOn w:val="DefaultParagraphFont"/>
+    <w:link w:val="Heading2"/>
+    <w:uiPriority w:val="9"/>
+    <w:semiHidden/>
+    <w:rsid w:val="00A10FD9"/>
+    <w:rPr>
+      <w:rFonts w:asciiTheme="majorHAnsi" w:cstheme="majorBidi" w:eastAsiaTheme="majorEastAsia" w:hAnsiTheme="majorHAnsi"/>
+      <w:color w:themeColor="accent1" w:themeShade="BF" w:val="0F4761"/>
+      <w:sz w:val="32"/>
+      <w:szCs w:val="32"/>
+    </w:rPr>
+  </w:style>
+  <w:style w:customStyle="1" w:styleId="Heading3Char" w:type="character">
+    <w:name w:val="Heading 3 Char"/>
+    <w:basedOn w:val="DefaultParagraphFont"/>
+    <w:link w:val="Heading3"/>
+    <w:uiPriority w:val="9"/>
+    <w:semiHidden/>
+    <w:rsid w:val="00A10FD9"/>
+    <w:rPr>
+      <w:rFonts w:cstheme="majorBidi" w:eastAsiaTheme="majorEastAsia"/>
+      <w:color w:themeColor="accent1" w:themeShade="BF" w:val="0F4761"/>
+      <w:sz w:val="28"/>
+      <w:szCs w:val="28"/>
+    </w:rPr>
+  </w:style>
+  <w:style w:customStyle="1" w:styleId="Heading4Char" w:type="character">
+    <w:name w:val="Heading 4 Char"/>
+    <w:basedOn w:val="DefaultParagraphFont"/>
+    <w:link w:val="Heading4"/>
+    <w:uiPriority w:val="9"/>
+    <w:semiHidden/>
+    <w:rsid w:val="00A10FD9"/>
+    <w:rPr>
+      <w:rFonts w:cstheme="majorBidi" w:eastAsiaTheme="majorEastAsia"/>
+      <w:i/>
+      <w:iCs/>
+      <w:color w:themeColor="accent1" w:themeShade="BF" w:val="0F4761"/>
+    </w:rPr>
+  </w:style>
+  <w:style w:customStyle="1" w:styleId="Heading5Char" w:type="character">
+    <w:name w:val="Heading 5 Char"/>
+    <w:basedOn w:val="DefaultParagraphFont"/>
+    <w:link w:val="Heading5"/>
+    <w:uiPriority w:val="9"/>
+    <w:semiHidden/>
+    <w:rsid w:val="00A10FD9"/>
+    <w:rPr>
+      <w:rFonts w:cstheme="majorBidi" w:eastAsiaTheme="majorEastAsia"/>
+      <w:color w:themeColor="accent1" w:themeShade="BF" w:val="0F4761"/>
+    </w:rPr>
+  </w:style>
+  <w:style w:customStyle="1" w:styleId="Heading6Char" w:type="character">
+    <w:name w:val="Heading 6 Char"/>
+    <w:basedOn w:val="DefaultParagraphFont"/>
+    <w:link w:val="Heading6"/>
+    <w:uiPriority w:val="9"/>
+    <w:semiHidden/>
+    <w:rsid w:val="00A10FD9"/>
+    <w:rPr>
+      <w:rFonts w:cstheme="majorBidi" w:eastAsiaTheme="majorEastAsia"/>
+      <w:i/>
+      <w:iCs/>
+      <w:color w:themeColor="text1" w:themeTint="A6" w:val="595959"/>
+    </w:rPr>
+  </w:style>
+  <w:style w:customStyle="1" w:styleId="Heading7Char" w:type="character">
+    <w:name w:val="Heading 7 Char"/>
+    <w:basedOn w:val="DefaultParagraphFont"/>
+    <w:link w:val="Heading7"/>
+    <w:uiPriority w:val="9"/>
+    <w:semiHidden/>
+    <w:rsid w:val="00A10FD9"/>
+    <w:rPr>
+      <w:rFonts w:cstheme="majorBidi" w:eastAsiaTheme="majorEastAsia"/>
+      <w:color w:themeColor="text1" w:themeTint="A6" w:val="595959"/>
+    </w:rPr>
+  </w:style>
+  <w:style w:customStyle="1" w:styleId="Heading8Char" w:type="character">
+    <w:name w:val="Heading 8 Char"/>
+    <w:basedOn w:val="DefaultParagraphFont"/>
+    <w:link w:val="Heading8"/>
+    <w:uiPriority w:val="9"/>
+    <w:semiHidden/>
+    <w:rsid w:val="00A10FD9"/>
+    <w:rPr>
+      <w:rFonts w:cstheme="majorBidi" w:eastAsiaTheme="majorEastAsia"/>
+      <w:i/>
+      <w:iCs/>
+      <w:color w:themeColor="text1" w:themeTint="D8" w:val="272727"/>
+    </w:rPr>
+  </w:style>
+  <w:style w:customStyle="1" w:styleId="Heading9Char" w:type="character">
+    <w:name w:val="Heading 9 Char"/>
+    <w:basedOn w:val="DefaultParagraphFont"/>
+    <w:link w:val="Heading9"/>
+    <w:uiPriority w:val="9"/>
+    <w:semiHidden/>
+    <w:rsid w:val="00A10FD9"/>
+    <w:rPr>
+      <w:rFonts w:cstheme="majorBidi" w:eastAsiaTheme="majorEastAsia"/>
+      <w:color w:themeColor="text1" w:themeTint="D8" w:val="272727"/>
+    </w:rPr>
+  </w:style>
+  <w:style w:styleId="BlockText" w:type="paragraph">
+    <w:name w:val="Block Text"/>
+    <w:basedOn w:val="BodyText"/>
+    <w:next w:val="BodyText"/>
+    <w:uiPriority w:val="9"/>
+    <w:unhideWhenUsed/>
+    <w:qFormat/>
+    <w:pPr>
+      <w:spacing w:after="100" w:before="100"/>
+      <w:ind w:firstLine="0" w:left="480" w:right="480"/>
+    </w:pPr>
+  </w:style>
+  <w:style w:styleId="FootnoteText" w:type="paragraph">
+    <w:name w:val="Footnote Text"/>
+    <w:basedOn w:val="Normal"/>
+    <w:next w:val="FootnoteText"/>
+    <w:uiPriority w:val="9"/>
+    <w:unhideWhenUsed/>
+    <w:qFormat/>
+  </w:style>
+  <w:style w:styleId="FootnoteBlockText" w:type="paragraph">
+    <w:name w:val="Footnote Block Text"/>
+    <w:basedOn w:val="FootnoteText"/>
+    <w:next w:val="FootnoteText"/>
+    <w:uiPriority w:val="9"/>
+    <w:unhideWhenUsed/>
+    <w:qFormat/>
+    <w:pPr>
+      <w:spacing w:after="100" w:before="100"/>
+      <w:ind w:firstLine="0" w:left="480" w:right="480"/>
+    </w:pPr>
+  </w:style>
+  <w:style w:default="1" w:styleId="DefaultParagraphFont" w:type="character">
+    <w:name w:val="Default Paragraph Font"/>
+    <w:semiHidden/>
+    <w:unhideWhenUsed/>
+  </w:style>
+  <w:style w:default="1" w:styleId="Table" w:type="table">
+    <w:name w:val="Table"/>
+    <w:basedOn w:val="TableNormal"/>
+    <w:semiHidden/>
+    <w:unhideWhenUsed/>
+    <w:qFormat/>
+    <w:tblPr>
+      <w:tblInd w:type="dxa" w:w="0"/>
+      <w:tblCellMar>
+        <w:top w:type="dxa" w:w="0"/>
+        <w:left w:type="dxa" w:w="108"/>
+        <w:bottom w:type="dxa" w:w="0"/>
+        <w:right w:type="dxa" w:w="108"/>
+      </w:tblCellMar>
+    </w:tblPr>
+    <w:tblStylePr w:type="firstRow">
+      <w:tcPr>
+        <w:tcBorders>
+          <w:bottom w:val="single"/>
+        </w:tcBorders>
+        <w:vAlign w:val="bottom"/>
+      </w:tcPr>
+    </w:tblStylePr>
+  </w:style>
+  <w:style w:customStyle="1" w:styleId="DefinitionTerm" w:type="paragraph">
+    <w:name w:val="Definition Term"/>
+    <w:basedOn w:val="Normal"/>
+    <w:next w:val="Definition"/>
+    <w:pPr>
+      <w:keepNext/>
+      <w:keepLines/>
+      <w:spacing w:after="0"/>
+    </w:pPr>
     <w:rPr>
       <w:b/>
-      <w:bCs/>
-    </w:rPr>
-  </w:style>
-  <w:style w:styleId="ListParagraph" w:type="paragraph">
-    <w:name w:val="List Paragraph"/>
+    </w:rPr>
+  </w:style>
+  <w:style w:customStyle="1" w:styleId="Definition" w:type="paragraph">
+    <w:name w:val="Definition"/>
     <w:basedOn w:val="Normal"/>
-    <w:qFormat/>
+  </w:style>
+  <w:style w:styleId="Caption" w:type="paragraph">
+    <w:name w:val="Caption"/>
+    <w:basedOn w:val="Normal"/>
+    <w:link w:val="BodyTextChar"/>
+    <w:pPr>
+      <w:spacing w:after="120" w:before="0"/>
+    </w:pPr>
+    <w:rPr>
+      <w:i/>
+    </w:rPr>
+  </w:style>
+  <w:style w:customStyle="1" w:styleId="TableCaption" w:type="paragraph">
+    <w:name w:val="Table Caption"/>
+    <w:basedOn w:val="Caption"/>
+    <w:pPr>
+      <w:keepNext/>
+    </w:pPr>
+  </w:style>
+  <w:style w:customStyle="1" w:styleId="ImageCaption" w:type="paragraph">
+    <w:name w:val="Image Caption"/>
+    <w:basedOn w:val="Caption"/>
+  </w:style>
+  <w:style w:customStyle="1" w:styleId="Figure" w:type="paragraph">
+    <w:name w:val="Figure"/>
+    <w:basedOn w:val="Normal"/>
+  </w:style>
+  <w:style w:customStyle="1" w:styleId="CaptionedFigure" w:type="paragraph">
+    <w:name w:val="Captioned Figure"/>
+    <w:basedOn w:val="Figure"/>
+    <w:pPr>
+      <w:keepNext/>
+    </w:pPr>
+  </w:style>
+  <w:style w:customStyle="1" w:styleId="BodyTextChar" w:type="character">
+    <w:name w:val="Body Text Char"/>
+    <w:basedOn w:val="DefaultParagraphFont"/>
+    <w:link w:val="BodyText"/>
+  </w:style>
+  <w:style w:customStyle="1" w:styleId="VerbatimChar" w:type="character">
+    <w:name w:val="Verbatim Char"/>
+    <w:basedOn w:val="BodyTextChar"/>
+    <w:rPr>
+      <w:rFonts w:ascii="Consolas" w:hAnsi="Consolas"/>
+      <w:sz w:val="22"/>
+    </w:rPr>
+  </w:style>
+  <w:style w:customStyle="1" w:styleId="SectionNumber" w:type="character">
+    <w:name w:val="Section Number"/>
+    <w:basedOn w:val="BodyTextChar"/>
+  </w:style>
+  <w:style w:styleId="FootnoteReference" w:type="character">
+    <w:name w:val="Footnote Reference"/>
+    <w:basedOn w:val="BodyTextChar"/>
+    <w:rPr>
+      <w:vertAlign w:val="superscript"/>
+    </w:rPr>
   </w:style>
   <w:style w:styleId="Hyperlink" w:type="character">
     <w:name w:val="Hyperlink"/>
-    <w:basedOn w:val="DefaultParagraphFont"/>
-    <w:uiPriority w:val="99"/>
+    <w:basedOn w:val="BodyTextChar"/>
+    <w:rPr>
+      <w:color w:themeColor="accent1" w:val="4F81BD"/>
+    </w:rPr>
+  </w:style>
+  <w:style w:styleId="TOCHeading" w:type="paragraph">
+    <w:name w:val="TOC Heading"/>
+    <w:basedOn w:val="Heading1"/>
+    <w:next w:val="BodyText"/>
+    <w:uiPriority w:val="39"/>
     <w:unhideWhenUsed/>
-    <w:rPr>
-      <w:color w:val="0563C1"/>
-      <w:u w:val="single"/>
-    </w:rPr>
-  </w:style>
-  <w:style w:styleId="FootnoteReference" w:type="character">
-    <w:name w:val="footnote reference"/>
-    <w:basedOn w:val="DefaultParagraphFont"/>
-    <w:uiPriority w:val="99"/>
-    <w:semiHidden/>
-    <w:unhideWhenUsed/>
-    <w:rPr>
-      <w:vertAlign w:val="superscript"/>
-    </w:rPr>
-  </w:style>
-  <w:style w:styleId="FootnoteText" w:type="paragraph">
-    <w:name w:val="footnote text"/>
-    <w:basedOn w:val="Normal"/>
-    <w:link w:val="FootnoteTextChar"/>
-    <w:uiPriority w:val="99"/>
-    <w:semiHidden/>
-    <w:unhideWhenUsed/>
+    <w:qFormat/>
     <w:pPr>
-      <w:spacing w:after="0" w:line="240" w:lineRule="auto"/>
+      <w:spacing w:before="240" w:line="259" w:lineRule="auto"/>
+      <w:outlineLvl w:val="9"/>
     </w:pPr>
     <w:rPr>
-      <w:sz w:val="20"/>
-      <w:szCs w:val="20"/>
-    </w:rPr>
-  </w:style>
-  <w:style w:styleId="FootnoteTextChar" w:type="character">
-    <w:name w:val="Footnote Text Char"/>
-    <w:basedOn w:val="DefaultParagraphFont"/>
-    <w:link w:val="FootnoteText"/>
-    <w:uiPriority w:val="99"/>
-    <w:semiHidden/>
-    <w:unhideWhenUsed/>
-    <w:rPr>
-      <w:sz w:val="20"/>
-      <w:szCs w:val="20"/>
-    </w:rPr>
-  </w:style>
-  <w:style w:styleId="EndnoteReference" w:type="character">
-    <w:name w:val="endnote reference"/>
-    <w:basedOn w:val="DefaultParagraphFont"/>
-    <w:uiPriority w:val="99"/>
-    <w:semiHidden/>
-    <w:unhideWhenUsed/>
-    <w:rPr>
-      <w:vertAlign w:val="superscript"/>
-    </w:rPr>
-  </w:style>
-  <w:style w:styleId="EndnoteText" w:type="paragraph">
-    <w:name w:val="endnote text"/>
-    <w:basedOn w:val="Normal"/>
-    <w:link w:val="EndnoteTextChar"/>
-    <w:uiPriority w:val="99"/>
-    <w:semiHidden/>
-    <w:unhideWhenUsed/>
-    <w:pPr>
-      <w:spacing w:after="0" w:line="240" w:lineRule="auto"/>
-    </w:pPr>
-    <w:rPr>
-      <w:sz w:val="20"/>
-      <w:szCs w:val="20"/>
-    </w:rPr>
-  </w:style>
-  <w:style w:styleId="EndnoteTextChar" w:type="character">
-    <w:name w:val="Endnote Text Char"/>
-    <w:basedOn w:val="DefaultParagraphFont"/>
-    <w:link w:val="EndnoteText"/>
-    <w:uiPriority w:val="99"/>
-    <w:semiHidden/>
-    <w:unhideWhenUsed/>
-    <w:rPr>
-      <w:sz w:val="20"/>
-      <w:szCs w:val="20"/>
-    </w:rPr>
-  </w:style>
-  <w:style w:customStyle="1" w:styleId="SourceCode" w:type="paragraph">
-    <w:name w:val="Source Code"/>
-    <w:basedOn w:val="Normal"/>
-    <w:link w:val="VerbatimChar"/>
-    <w:pPr>
-      <w:wordWrap w:val="off"/>
-    </w:pPr>
-  </w:style>
-  <w:style w:customStyle="1" w:styleId="KeywordTok" w:type="character">
-    <w:name w:val="KeywordTok"/>
-    <w:basedOn w:val="VerbatimChar"/>
-    <w:rPr>
-      <w:b/>
-      <w:color w:val="007020"/>
-    </w:rPr>
-  </w:style>
-  <w:style w:customStyle="1" w:styleId="DataTypeTok" w:type="character">
-    <w:name w:val="DataTypeTok"/>
-    <w:basedOn w:val="VerbatimChar"/>
-    <w:rPr>
-      <w:color w:val="902000"/>
-    </w:rPr>
-  </w:style>
-  <w:style w:customStyle="1" w:styleId="DecValTok" w:type="character">
-    <w:name w:val="DecValTok"/>
-    <w:basedOn w:val="VerbatimChar"/>
-    <w:rPr>
-      <w:color w:val="40a070"/>
-    </w:rPr>
-  </w:style>
-  <w:style w:customStyle="1" w:styleId="BaseNTok" w:type="character">
-    <w:name w:val="BaseNTok"/>
-    <w:basedOn w:val="VerbatimChar"/>
-    <w:rPr>
-      <w:color w:val="40a070"/>
-    </w:rPr>
-  </w:style>
-  <w:style w:customStyle="1" w:styleId="FloatTok" w:type="character">
-    <w:name w:val="FloatTok"/>
-    <w:basedOn w:val="VerbatimChar"/>
-    <w:rPr>
-      <w:color w:val="40a070"/>
-    </w:rPr>
-  </w:style>
-  <w:style w:customStyle="1" w:styleId="ConstantTok" w:type="character">
-    <w:name w:val="ConstantTok"/>
-    <w:basedOn w:val="VerbatimChar"/>
-    <w:rPr>
-      <w:color w:val="880000"/>
-    </w:rPr>
-  </w:style>
-  <w:style w:customStyle="1" w:styleId="CharTok" w:type="character">
-    <w:name w:val="CharTok"/>
-    <w:basedOn w:val="VerbatimChar"/>
-    <w:rPr>
-      <w:color w:val="4070a0"/>
-    </w:rPr>
-  </w:style>
-  <w:style w:customStyle="1" w:styleId="SpecialCharTok" w:type="character">
-    <w:name w:val="SpecialCharTok"/>
-    <w:basedOn w:val="VerbatimChar"/>
-    <w:rPr>
-      <w:color w:val="4070a0"/>
-    </w:rPr>
-  </w:style>
-  <w:style w:customStyle="1" w:styleId="StringTok" w:type="character">
-    <w:name w:val="StringTok"/>
-    <w:basedOn w:val="VerbatimChar"/>
-    <w:rPr>
-      <w:color w:val="4070a0"/>
-    </w:rPr>
-  </w:style>
-  <w:style w:customStyle="1" w:styleId="VerbatimStringTok" w:type="character">
-    <w:name w:val="VerbatimStringTok"/>
-    <w:basedOn w:val="VerbatimChar"/>
-    <w:rPr>
-      <w:color w:val="4070a0"/>
-    </w:rPr>
-  </w:style>
-  <w:style w:customStyle="1" w:styleId="SpecialStringTok" w:type="character">
-    <w:name w:val="SpecialStringTok"/>
-    <w:basedOn w:val="VerbatimChar"/>
-    <w:rPr>
-      <w:color w:val="bb6688"/>
-    </w:rPr>
-  </w:style>
-  <w:style w:customStyle="1" w:styleId="ImportTok" w:type="character">
-    <w:name w:val="ImportTok"/>
-    <w:basedOn w:val="VerbatimChar"/>
-    <w:rPr>
-      <w:b/>
-      <w:color w:val="008000"/>
-    </w:rPr>
-  </w:style>
-  <w:style w:customStyle="1" w:styleId="CommentTok" w:type="character">
-    <w:name w:val="CommentTok"/>
-    <w:basedOn w:val="VerbatimChar"/>
-    <w:rPr>
-      <w:i/>
-      <w:color w:val="60a0b0"/>
-    </w:rPr>
-  </w:style>
-  <w:style w:customStyle="1" w:styleId="DocumentationTok" w:type="character">
-    <w:name w:val="DocumentationTok"/>
-    <w:basedOn w:val="VerbatimChar"/>
-    <w:rPr>
-      <w:i/>
-      <w:color w:val="ba2121"/>
-    </w:rPr>
-  </w:style>
-  <w:style w:customStyle="1" w:styleId="AnnotationTok" w:type="character">
-    <w:name w:val="AnnotationTok"/>
-    <w:basedOn w:val="VerbatimChar"/>
-    <w:rPr>
-      <w:b/>
-      <w:i/>
-      <w:color w:val="60a0b0"/>
-    </w:rPr>
-  </w:style>
-  <w:style w:customStyle="1" w:styleId="CommentVarTok" w:type="character">
-    <w:name w:val="CommentVarTok"/>
-    <w:basedOn w:val="VerbatimChar"/>
-    <w:rPr>
-      <w:b/>
-      <w:i/>
-      <w:color w:val="60a0b0"/>
-    </w:rPr>
-  </w:style>
-  <w:style w:customStyle="1" w:styleId="OtherTok" w:type="character">
-    <w:name w:val="OtherTok"/>
-    <w:basedOn w:val="VerbatimChar"/>
-    <w:rPr>
-      <w:color w:val="007020"/>
-    </w:rPr>
-  </w:style>
-  <w:style w:customStyle="1" w:styleId="FunctionTok" w:type="character">
-    <w:name w:val="FunctionTok"/>
-    <w:basedOn w:val="VerbatimChar"/>
-    <w:rPr>
-      <w:color w:val="06287e"/>
-    </w:rPr>
-  </w:style>
-  <w:style w:customStyle="1" w:styleId="VariableTok" w:type="character">
-    <w:name w:val="VariableTok"/>
-    <w:basedOn w:val="VerbatimChar"/>
-    <w:rPr>
-      <w:color w:val="19177c"/>
-    </w:rPr>
-  </w:style>
-  <w:style w:customStyle="1" w:styleId="ControlFlowTok" w:type="character">
-    <w:name w:val="ControlFlowTok"/>
-    <w:basedOn w:val="VerbatimChar"/>
-    <w:rPr>
-      <w:b/>
-      <w:color w:val="007020"/>
-    </w:rPr>
-  </w:style>
-  <w:style w:customStyle="1" w:styleId="OperatorTok" w:type="character">
-    <w:name w:val="OperatorTok"/>
-    <w:basedOn w:val="VerbatimChar"/>
-    <w:rPr>
-      <w:color w:val="666666"/>
-    </w:rPr>
-  </w:style>
-  <w:style w:customStyle="1" w:styleId="BuiltInTok" w:type="character">
-    <w:name w:val="BuiltInTok"/>
-    <w:basedOn w:val="VerbatimChar"/>
-    <w:rPr>
-      <w:color w:val="008000"/>
-    </w:rPr>
-  </w:style>
-  <w:style w:customStyle="1" w:styleId="ExtensionTok" w:type="character">
-    <w:name w:val="ExtensionTok"/>
-    <w:basedOn w:val="VerbatimChar"/>
-    <w:rPr/>
-  </w:style>
-  <w:style w:customStyle="1" w:styleId="PreprocessorTok" w:type="character">
-    <w:name w:val="PreprocessorTok"/>
-    <w:basedOn w:val="VerbatimChar"/>
-    <w:rPr>
-      <w:color w:val="bc7a00"/>
-    </w:rPr>
-  </w:style>
-  <w:style w:customStyle="1" w:styleId="AttributeTok" w:type="character">
-    <w:name w:val="AttributeTok"/>
-    <w:basedOn w:val="VerbatimChar"/>
-    <w:rPr>
-      <w:color w:val="7d9029"/>
-    </w:rPr>
-  </w:style>
-  <w:style w:customStyle="1" w:styleId="RegionMarkerTok" w:type="character">
-    <w:name w:val="RegionMarkerTok"/>
-    <w:basedOn w:val="VerbatimChar"/>
-    <w:rPr/>
-  </w:style>
-  <w:style w:customStyle="1" w:styleId="InformationTok" w:type="character">
-    <w:name w:val="InformationTok"/>
-    <w:basedOn w:val="VerbatimChar"/>
-    <w:rPr>
-      <w:b/>
-      <w:i/>
-      <w:color w:val="60a0b0"/>
-    </w:rPr>
-  </w:style>
-  <w:style w:customStyle="1" w:styleId="WarningTok" w:type="character">
-    <w:name w:val="WarningTok"/>
-    <w:basedOn w:val="VerbatimChar"/>
-    <w:rPr>
-      <w:b/>
-      <w:i/>
-      <w:color w:val="60a0b0"/>
-    </w:rPr>
-  </w:style>
-  <w:style w:customStyle="1" w:styleId="AlertTok" w:type="character">
-    <w:name w:val="AlertTok"/>
-    <w:basedOn w:val="VerbatimChar"/>
-    <w:rPr>
-      <w:b/>
-      <w:color w:val="ff0000"/>
-    </w:rPr>
-  </w:style>
-  <w:style w:customStyle="1" w:styleId="ErrorTok" w:type="character">
-    <w:name w:val="ErrorTok"/>
-    <w:basedOn w:val="VerbatimChar"/>
-    <w:rPr>
-      <w:b/>
-      <w:color w:val="ff0000"/>
-    </w:rPr>
-  </w:style>
-  <w:style w:customStyle="1" w:styleId="NormalTok" w:type="character">
-    <w:name w:val="NormalTok"/>
-    <w:basedOn w:val="VerbatimChar"/>
-    <w:rPr/>
-  </w:style>
-  <w:style w:styleId="Table" w:type="table">
-    <w:name w:val="Table"/>
-    <w:tblPr>
-      <w:tblBorders>
-        <w:top w:color="000000" w:space="0" w:sz="4" w:val="single"/>
-        <w:left w:color="000000" w:space="0" w:sz="4" w:val="single"/>
-        <w:bottom w:color="000000" w:space="0" w:sz="4" w:val="single"/>
-        <w:right w:color="000000" w:space="0" w:sz="4" w:val="single"/>
-        <w:insideH w:color="000000" w:space="0" w:sz="4" w:val="single"/>
-        <w:insideV w:color="000000" w:space="0" w:sz="4" w:val="single"/>
-      </w:tblBorders>
-    </w:tblPr>
+      <w:rFonts w:asciiTheme="majorHAnsi" w:cstheme="majorBidi" w:eastAsiaTheme="majorEastAsia" w:hAnsiTheme="majorHAnsi"/>
+      <w:b w:val="0"/>
+      <w:bCs w:val="0"/>
+      <w:color w:themeColor="accent1" w:themeShade="BF" w:val="365F91"/>
+    </w:rPr>
   </w:style>
   <w:style w:type="paragraph" w:customStyle="1" w:styleId="SourceCode">
     <w:name w:val="Source Code"/>

</xml_diff>

<commit_message>
KB: the app determines your skin type, it does not read it
Corrects the verb in KB sections 6 and 7 and in the two agent email templates
that carry the same safety line. "Determines" is what the app actually does.

The Q2 investor update AS_SENT already used "determines", so the sent record
was correct and the KB had simply never caught up.

Two instances deliberately left alone: campaigns/consumer-drip.md Touch 2 is
live in GHL and needs Scott's edit there first, and the investor-update draft
is superseded by the AS_SENT copy.

Co-Authored-By: Claude Opus 5 <noreply@anthropic.com>
</commit_message>
<xml_diff>
--- a/Enyrgy_Paperclip_Knowledge_Base.docx
+++ b/Enyrgy_Paperclip_Knowledge_Base.docx
@@ -1375,7 +1375,7 @@
         </w:numPr>
       </w:pPr>
       <w:r>
-        <w:t xml:space="preserve">The app reads your skin type, sets your dose, and ends the session for you.</w:t>
+        <w:t xml:space="preserve">The app determines your skin type, sets your dose, and ends the session for you.</w:t>
       </w:r>
     </w:p>
     <w:p>
@@ -1505,7 +1505,7 @@
         </w:numPr>
       </w:pPr>
       <w:r>
-        <w:t xml:space="preserve">Is this safe? Fair worry. Sunlight is about 95 percent UVA. We flipped it: over 90 percent UVB, under 10 percent UVA. The app reads your skin type, sets your personal dose, and ends the session for you. 25,000+ sessions in, zero burns, zero adverse events.</w:t>
+        <w:t xml:space="preserve">Is this safe? Fair worry. Sunlight is about 95 percent UVA. We flipped it: over 90 percent UVB, under 10 percent UVA. The app determines your skin type, sets your personal dose, and ends the session for you. 25,000+ sessions in, zero burns, zero adverse events.</w:t>
       </w:r>
     </w:p>
     <w:p>

</xml_diff>

<commit_message>
KB 14: facility referral commission is $600 per Consumer Unit sale
Adds the one partner figure approved for quoting. A facility hands its
members a unique link to shop.enyrgy.com, the member buys direct at $2,995,
and the facility is credited $600 with no inventory carried.

White-label and distribution terms remain per-deal and go to the CEO; this
line is explicit that the referral commission is the exception, so agents do
not read it as licence to quote partner figures generally.

Cross-references section 3: the referral link does not change who the buyer
of record is, so the member's purchase stays HSA/FSA eligible.

Co-Authored-By: Claude Opus 5 <noreply@anthropic.com>
</commit_message>
<xml_diff>
--- a/Enyrgy_Paperclip_Knowledge_Base.docx
+++ b/Enyrgy_Paperclip_Knowledge_Base.docx
@@ -2215,6 +2215,56 @@
       </w:pPr>
       <w:r>
         <w:t xml:space="preserve">Partner arrangements offered: Enyrgy offers both white-label (a partner sells the platform under their own brand, as Lumanova does) and distribution (a partner distributes to other facilities). Both are real, offered arrangements. Specific terms are handled per deal; confirm with the CEO before quoting figures.</w:t>
+      </w:r>
+    </w:p>
+    <w:p>
+      <w:pPr>
+        <w:pStyle w:val="Compact"/>
+        <w:numPr>
+          <w:ilvl w:val="0"/>
+          <w:numId w:val="1014"/>
+        </w:numPr>
+      </w:pPr>
+      <w:r>
+        <w:rPr>
+          <w:b/>
+          <w:bCs/>
+        </w:rPr>
+        <w:t xml:space="preserve">Facility referral commission: $600 per Consumer Unit sale.</w:t>
+      </w:r>
+      <w:r>
+        <w:t xml:space="preserve"> </w:t>
+      </w:r>
+      <w:r>
+        <w:t xml:space="preserve">A facility hands its members a unique referral link to</w:t>
+      </w:r>
+      <w:r>
+        <w:t xml:space="preserve"> </w:t>
+      </w:r>
+      <w:r>
+        <w:rPr>
+          <w:rStyle w:val="VerbatimChar"/>
+        </w:rPr>
+        <w:t xml:space="preserve">shop.enyrgy.com</w:t>
+      </w:r>
+      <w:r>
+        <w:t xml:space="preserve">. The member purchases directly from Enyrgy at the $2,995 MSRP and the facility is credited</w:t>
+      </w:r>
+      <w:r>
+        <w:t xml:space="preserve"> </w:t>
+      </w:r>
+      <w:r>
+        <w:rPr>
+          <w:b/>
+          <w:bCs/>
+        </w:rPr>
+        <w:t xml:space="preserve">$600</w:t>
+      </w:r>
+      <w:r>
+        <w:t xml:space="preserve"> </w:t>
+      </w:r>
+      <w:r>
+        <w:t xml:space="preserve">on that sale. The facility carries no inventory and buys nothing. This is the one partner figure that IS approved for quoting; white-label and distribution terms are still per-deal and go to the CEO. Because the member is the buyer of record, that purchase is HSA/FSA eligible (see §3) — the referral link does not change whose purchase it is.</w:t>
       </w:r>
     </w:p>
     <w:bookmarkEnd w:id="23"/>

</xml_diff>

<commit_message>
KB 14: referral arrangements escalate to Scott, agents do not run them
Corrects 41df19ae, which said the $600 commission was approved for agent
quoting. Scott handles referral arrangements personally.

Kept the figure in the KB rather than hiding it, because Commercial Drip
Touch 7 states $600 in the email itself, so any facility that received it
already has the number. An agent may confirm it if quoted back, but must not
negotiate, extend, or discuss terms -- hand off, same as white-label and
distribution.

Co-Authored-By: Claude Opus 5 <noreply@anthropic.com>
</commit_message>
<xml_diff>
--- a/Enyrgy_Paperclip_Knowledge_Base.docx
+++ b/Enyrgy_Paperclip_Knowledge_Base.docx
@@ -2230,7 +2230,7 @@
           <w:b/>
           <w:bCs/>
         </w:rPr>
-        <w:t xml:space="preserve">Facility referral commission: $600 per Consumer Unit sale.</w:t>
+        <w:t xml:space="preserve">Facility referral arrangement: ESCALATE TO SCOTT. Do not run this conversation.</w:t>
       </w:r>
       <w:r>
         <w:t xml:space="preserve"> </w:t>
@@ -2248,23 +2248,42 @@
         <w:t xml:space="preserve">shop.enyrgy.com</w:t>
       </w:r>
       <w:r>
-        <w:t xml:space="preserve">. The member purchases directly from Enyrgy at the $2,995 MSRP and the facility is credited</w:t>
-      </w:r>
-      <w:r>
-        <w:t xml:space="preserve"> </w:t>
-      </w:r>
-      <w:r>
-        <w:rPr>
-          <w:b/>
-          <w:bCs/>
-        </w:rPr>
-        <w:t xml:space="preserve">$600</w:t>
-      </w:r>
-      <w:r>
-        <w:t xml:space="preserve"> </w:t>
-      </w:r>
-      <w:r>
-        <w:t xml:space="preserve">on that sale. The facility carries no inventory and buys nothing. This is the one partner figure that IS approved for quoting; white-label and distribution terms are still per-deal and go to the CEO. Because the member is the buyer of record, that purchase is HSA/FSA eligible (see §3) — the referral link does not change whose purchase it is.</w:t>
+        <w:t xml:space="preserve">; the member purchases directly from Enyrgy at the $2,995 MSRP and the facility is credited a commission. The facility carries no inventory and buys nothing. Because the member is the buyer of record, that purchase is HSA/FSA eligible (see §3) — the referral link does not change whose purchase it is.</w:t>
+      </w:r>
+    </w:p>
+    <w:p>
+      <w:pPr>
+        <w:pStyle w:val="Compact"/>
+        <w:numPr>
+          <w:ilvl w:val="1"/>
+          <w:numId w:val="1015"/>
+        </w:numPr>
+      </w:pPr>
+      <w:r>
+        <w:rPr>
+          <w:b/>
+          <w:bCs/>
+        </w:rPr>
+        <w:t xml:space="preserve">The commission is $600 per Consumer Unit sale, and this figure appears in Commercial Drip Touch 7</w:t>
+      </w:r>
+      <w:r>
+        <w:t xml:space="preserve">, so a facility that received that email already has it. An agent may therefore confirm the figure if a facility quotes it back, but</w:t>
+      </w:r>
+      <w:r>
+        <w:t xml:space="preserve"> </w:t>
+      </w:r>
+      <w:r>
+        <w:rPr>
+          <w:b/>
+          <w:bCs/>
+        </w:rPr>
+        <w:t xml:space="preserve">must not negotiate, extend, or discuss terms</w:t>
+      </w:r>
+      <w:r>
+        <w:t xml:space="preserve"> </w:t>
+      </w:r>
+      <w:r>
+        <w:t xml:space="preserve">— hand off to Scott, same as white-label and distribution. Scott handles referral arrangements personally (decision, Aug 14 2026).</w:t>
       </w:r>
     </w:p>
     <w:bookmarkEnd w:id="23"/>
@@ -2931,6 +2950,9 @@
   <w:num w:numId="1014">
     <w:abstractNumId w:val="991"/>
   </w:num>
+  <w:num w:numId="1015">
+    <w:abstractNumId w:val="991"/>
+  </w:num>
 </w:numbering>
 </file>
 

</xml_diff>

<commit_message>
KB 13: record the $10M current company valuation
Adds the figure agents previously had no answer for, and draws the line
against the conversion mechanism: the 20 percent discount runs off an
independent SEC valuation taken at conversion, not off this number. Without
that, an agent asked about valuation could present $10M as the conversion
price.

Placed in section 13 alongside the other quotable offering terms (raise size,
minimum, coupon, term) rather than gated, since it is offering detail of the
same kind.

Co-Authored-By: Claude Opus 5 <noreply@anthropic.com>
</commit_message>
<xml_diff>
--- a/Enyrgy_Paperclip_Knowledge_Base.docx
+++ b/Enyrgy_Paperclip_Knowledge_Base.docx
@@ -2028,6 +2028,44 @@
       </w:pPr>
       <w:r>
         <w:t xml:space="preserve">Structure: Private Credit, Promissory Note.</w:t>
+      </w:r>
+    </w:p>
+    <w:p>
+      <w:pPr>
+        <w:pStyle w:val="Compact"/>
+        <w:numPr>
+          <w:ilvl w:val="0"/>
+          <w:numId w:val="1013"/>
+        </w:numPr>
+      </w:pPr>
+      <w:r>
+        <w:rPr>
+          <w:b/>
+          <w:bCs/>
+        </w:rPr>
+        <w:t xml:space="preserve">Current company valuation: $10M.</w:t>
+      </w:r>
+      <w:r>
+        <w:t xml:space="preserve"> </w:t>
+      </w:r>
+      <w:r>
+        <w:t xml:space="preserve">This is the company’s present valuation. It is</w:t>
+      </w:r>
+      <w:r>
+        <w:t xml:space="preserve"> </w:t>
+      </w:r>
+      <w:r>
+        <w:rPr>
+          <w:b/>
+          <w:bCs/>
+        </w:rPr>
+        <w:t xml:space="preserve">not</w:t>
+      </w:r>
+      <w:r>
+        <w:t xml:space="preserve"> </w:t>
+      </w:r>
+      <w:r>
+        <w:t xml:space="preserve">the basis for the conversion discount below, which discounts from an independent SEC valuation obtained at the time of conversion. Do not present $10M as a conversion price or imply the two are the same number.</w:t>
       </w:r>
     </w:p>
     <w:p>

</xml_diff>

<commit_message>
KB: cite Palacios & Gonzalez for the sunny-climate objection
The sun objection appears in seven places across the KB, drips, lead magnets
and the OneSource material, and was unsourced in all of them. It now has a
peer-reviewed citation.

Added to section 4 alongside the other sourced literature findings, and as a
consumer objection script in section 7 where an agent would reach for it.

The quote is the paper's own Highlights line, not something lifted from the
discussion: "Low vitamin D status is a problem even in countries with sun
exposure all year round." Free to read on PMC.

Three limits recorded with it, because each is a way this citation could be
misused: it gives no single headline prevalence figure so it cannot source the
77 percent; it says nothing about UVB devices so it supports the problem and
never the platform; and it is 2014 data, fine for establishing the phenomenon
and not for current prevalence.

Co-Authored-By: Claude Opus 5 <noreply@anthropic.com>
</commit_message>
<xml_diff>
--- a/Enyrgy_Paperclip_Knowledge_Base.docx
+++ b/Enyrgy_Paperclip_Knowledge_Base.docx
@@ -1186,6 +1186,82 @@
       <w:r>
         <w:t xml:space="preserve">- Dosing reference used in the research: roughly 10 to 15 minutes of midday sun, three times per week.</w:t>
       </w:r>
+      <w:r>
+        <w:t xml:space="preserve"> </w:t>
+      </w:r>
+      <w:r>
+        <w:t xml:space="preserve">-</w:t>
+      </w:r>
+      <w:r>
+        <w:t xml:space="preserve"> </w:t>
+      </w:r>
+      <w:r>
+        <w:rPr>
+          <w:b/>
+          <w:bCs/>
+        </w:rPr>
+        <w:t xml:space="preserve">Sunny climates do not prevent it (use this for the sun objection):</w:t>
+      </w:r>
+      <w:r>
+        <w:t xml:space="preserve"> </w:t>
+      </w:r>
+      <w:r>
+        <w:t xml:space="preserve">low vitamin D status is a problem even in countries with sun exposure all year round (Palacios C, Gonzalez L.</w:t>
+      </w:r>
+      <w:r>
+        <w:t xml:space="preserve"> </w:t>
+      </w:r>
+      <w:r>
+        <w:t xml:space="preserve">“Is vitamin D deficiency a major global public health problem?”</w:t>
+      </w:r>
+      <w:r>
+        <w:t xml:space="preserve"> </w:t>
+      </w:r>
+      <w:r>
+        <w:rPr>
+          <w:i/>
+          <w:iCs/>
+        </w:rPr>
+        <w:t xml:space="preserve">J Steroid Biochem Mol Biol</w:t>
+      </w:r>
+      <w:r>
+        <w:t xml:space="preserve"> </w:t>
+      </w:r>
+      <w:r>
+        <w:t xml:space="preserve">2014; PMC4018438, free to read). The paper’s own Highlights state it verbatim:</w:t>
+      </w:r>
+      <w:r>
+        <w:t xml:space="preserve"> </w:t>
+      </w:r>
+      <w:r>
+        <w:rPr>
+          <w:b/>
+          <w:bCs/>
+        </w:rPr>
+        <w:t xml:space="preserve">“Low vitamin D status is a problem even in countries with sun exposure all year round.”</w:t>
+      </w:r>
+      <w:r>
+        <w:t xml:space="preserve"> </w:t>
+      </w:r>
+      <w:r>
+        <w:t xml:space="preserve">Quote that line as written.</w:t>
+      </w:r>
+      <w:r>
+        <w:t xml:space="preserve"> </w:t>
+      </w:r>
+      <w:r>
+        <w:rPr>
+          <w:b/>
+          <w:bCs/>
+        </w:rPr>
+        <w:t xml:space="preserve">Three limits.</w:t>
+      </w:r>
+      <w:r>
+        <w:t xml:space="preserve"> </w:t>
+      </w:r>
+      <w:r>
+        <w:t xml:space="preserve">(1) It reports prevalence by region, age group and threshold and gives no single headline figure, so it CANNOT source the 77 percent. (2) It says nothing about UVB devices or phototherapy, so never present it as support for the platform itself, only for the problem. (3) 2014 data: fine for establishing that the phenomenon exists, not for current prevalence.</w:t>
+      </w:r>
     </w:p>
     <w:bookmarkEnd w:id="12"/>
     <w:bookmarkEnd w:id="13"/>
@@ -1601,6 +1677,18 @@
       </w:pPr>
       <w:r>
         <w:t xml:space="preserve">I will just go outside. Going outside works if you have 2 to 4 hours of mid-day sun to spare, plus the UVA aging and skin risk that rides along. Enyrgy gets you there in 2 to 4 minutes, about 60x the efficiency, without the downside.</w:t>
+      </w:r>
+    </w:p>
+    <w:p>
+      <w:pPr>
+        <w:pStyle w:val="Compact"/>
+        <w:numPr>
+          <w:ilvl w:val="0"/>
+          <w:numId w:val="1009"/>
+        </w:numPr>
+      </w:pPr>
+      <w:r>
+        <w:t xml:space="preserve">We get plenty of sun here. Fair assumption, and testing settles it faster than arguing. Indoor work, sunscreen and window glass all block UVB at any latitude. A 2014 global review in the Journal of Steroid Biochemistry and Molecular Biology concluded that low vitamin D status is a problem even in countries with sun exposure all year round.</w:t>
       </w:r>
     </w:p>
     <w:p>

</xml_diff>

<commit_message>
KB 16.7: drop the outstanding-review note
The counsel and manufacturer review has happened, so the caveat is stale.

Co-Authored-By: Claude Opus 5 <noreply@anthropic.com>
</commit_message>
<xml_diff>
--- a/Enyrgy_Paperclip_Knowledge_Base.docx
+++ b/Enyrgy_Paperclip_Knowledge_Base.docx
@@ -3886,24 +3886,6 @@
       </w:pPr>
       <w:r>
         <w:rPr>
-          <w:b/>
-          <w:bCs/>
-        </w:rPr>
-        <w:t xml:space="preserve">Still outstanding:</w:t>
-      </w:r>
-      <w:r>
-        <w:t xml:space="preserve"> </w:t>
-      </w:r>
-      <w:r>
-        <w:t xml:space="preserve">the previous printing is with customers, and the decision has not been reviewed by counsel or the manufacturer.</w:t>
-      </w:r>
-    </w:p>
-    <w:p>
-      <w:pPr>
-        <w:pStyle w:val="BodyText"/>
-      </w:pPr>
-      <w:r>
-        <w:rPr>
           <w:i/>
           <w:iCs/>
         </w:rPr>

</xml_diff>

<commit_message>
KB: correct Scott's track record and Brian's title
Section 1 said "8 startups, 5 exits, $500M+" on a bullet marked verified
and investor-facing. Two problems. The eight is the count of previous
startups, not the total, and Enyrgy is the ninth. And eleven M&A
transactions led, buy-side and sell-side, representing $249M, were missing
entirely.

The line now states both figures with a rule against merging them: the
$500M is exit value from companies he founded or helped build, the $249M is
transaction value from deals he led. Different work, and combining them
into one number is the inflation section 8 exists to prevent.

Brian Cameron corrected from CFO to fractional CFO in both places. He is a
contracted service provider rather than an officer, and the previous
wording overstated the relationship on a line investors read.

Confirmed by Scott, 2026-08-25.

Co-Authored-By: Claude Opus 5 <noreply@anthropic.com>
</commit_message>
<xml_diff>
--- a/Enyrgy_Paperclip_Knowledge_Base.docx
+++ b/Enyrgy_Paperclip_Knowledge_Base.docx
@@ -193,7 +193,7 @@
         </w:numPr>
       </w:pPr>
       <w:r>
-        <w:t xml:space="preserve">Founders and team: Scott Hansbury (Co-founder &amp; CEO), David Letourneau (President and Co-Founder), Brian Cameron (CFO).</w:t>
+        <w:t xml:space="preserve">Founders and team: Scott Hansbury (Co-founder &amp; CEO), David Letourneau (President and Co-Founder), Brian Cameron (fractional CFO).</w:t>
       </w:r>
     </w:p>
     <w:p>
@@ -205,17 +205,46 @@
         </w:numPr>
       </w:pPr>
       <w:r>
-        <w:t xml:space="preserve">Founder track record (verified, investor-facing): Scott Hansbury, 8 startups, 5 exits, $500M+ in value created. David Letourneau, scaled Alair Homes from 1 to 100+ locations, $750M+ in sales.</w:t>
-      </w:r>
-      <w:r>
-        <w:t xml:space="preserve"> </w:t>
-      </w:r>
-      <w:r>
-        <w:rPr>
-          <w:b/>
-          <w:bCs/>
-        </w:rPr>
-        <w:t xml:space="preserve">Brian Cameron, CFO, is a former securities regulator</w:t>
+        <w:t xml:space="preserve">Founder track record (verified, investor-facing): Scott Hansbury,</w:t>
+      </w:r>
+      <w:r>
+        <w:t xml:space="preserve"> </w:t>
+      </w:r>
+      <w:r>
+        <w:rPr>
+          <w:b/>
+          <w:bCs/>
+        </w:rPr>
+        <w:t xml:space="preserve">five exits from his previous eight startups totaling $500M+ in enterprise value, plus eleven M&amp;A transactions led, buy-side and sell-side, representing an additional $249M</w:t>
+      </w:r>
+      <w:r>
+        <w:t xml:space="preserve"> </w:t>
+      </w:r>
+      <w:r>
+        <w:t xml:space="preserve">(confirmed by Scott, 2026-08-25). Enyrgy is his ninth startup.</w:t>
+      </w:r>
+      <w:r>
+        <w:t xml:space="preserve"> </w:t>
+      </w:r>
+      <w:r>
+        <w:rPr>
+          <w:b/>
+          <w:bCs/>
+        </w:rPr>
+        <w:t xml:space="preserve">State the two figures separately and never combine them into a single total</w:t>
+      </w:r>
+      <w:r>
+        <w:t xml:space="preserve">, since they describe different work: the $500M is exit value from companies he founded or helped build, the $249M is transaction value from deals he led. David Letourneau, scaled Alair Homes from 1 to 100+ locations, $750M+ in sales.</w:t>
+      </w:r>
+      <w:r>
+        <w:t xml:space="preserve"> </w:t>
+      </w:r>
+      <w:r>
+        <w:rPr>
+          <w:b/>
+          <w:bCs/>
+        </w:rPr>
+        <w:t xml:space="preserve">Brian Cameron, fractional CFO, is a former securities regulator</w:t>
       </w:r>
       <w:r>
         <w:t xml:space="preserve"> </w:t>

</xml_diff>

<commit_message>
KB 14b: add the commercial dealer program
The KB had zero mentions of dealers, the commission ladder or deal
registration, three weeks after the system went live. An agent receiving a
dealer email or a facility asking about reselling had nothing to work from,
and the KB's own rule is to escalate rather than guess.

New section 14b carries what an agent legitimately needs: that the program
exists, that it is the $8,950 commercial unit and not the $600 facility
referral, the commission ladder with the MAP floor, that registration holds
a named facility for 90 days, and that the dealer roster is confidential.
Terms escalate to Scott, same as white-label and distribution.

Two lookup rows added and "Customers" corrected to "Users" in the table.

Co-Authored-By: Claude Opus 5 <noreply@anthropic.com>
</commit_message>
<xml_diff>
--- a/Enyrgy_Paperclip_Knowledge_Base.docx
+++ b/Enyrgy_Paperclip_Knowledge_Base.docx
@@ -2,7 +2,7 @@
 <file path=word/document.xml><?xml version="1.0" encoding="utf-8"?>
 <w:document xmlns:w="http://schemas.openxmlformats.org/wordprocessingml/2006/main" xmlns:m="http://schemas.openxmlformats.org/officeDocument/2006/math" xmlns:r="http://schemas.openxmlformats.org/officeDocument/2006/relationships" xmlns:o="urn:schemas-microsoft-com:office:office" xmlns:v="urn:schemas-microsoft-com:vml" xmlns:w10="urn:schemas-microsoft-com:office:word" xmlns:a="http://schemas.openxmlformats.org/drawingml/2006/main" xmlns:pic="http://schemas.openxmlformats.org/drawingml/2006/picture" xmlns:wp="http://schemas.openxmlformats.org/drawingml/2006/wordprocessingDrawing">
   <w:body>
-    <w:bookmarkStart w:id="33" w:name="enyrgy-knowledge-base-shared-agent-read"/>
+    <w:bookmarkStart w:id="34" w:name="enyrgy-knowledge-base-shared-agent-read"/>
     <w:p>
       <w:pPr>
         <w:pStyle w:val="Heading1"/>
@@ -2702,7 +2702,362 @@
       </w:r>
     </w:p>
     <w:bookmarkEnd w:id="23"/>
-    <w:bookmarkStart w:id="24" w:name="key-reference-facts-quick-lookup"/>
+    <w:bookmarkStart w:id="24" w:name="X4c841973e31ed136422f0c15a4f362a6c73c44a"/>
+    <w:p>
+      <w:pPr>
+        <w:pStyle w:val="Heading2"/>
+      </w:pPr>
+      <w:r>
+        <w:t xml:space="preserve">14b. Commercial dealer program (ESCALATE TO SCOTT)</w:t>
+      </w:r>
+    </w:p>
+    <w:p>
+      <w:pPr>
+        <w:pStyle w:val="FirstParagraph"/>
+      </w:pPr>
+      <w:r>
+        <w:rPr>
+          <w:b/>
+          <w:bCs/>
+        </w:rPr>
+        <w:t xml:space="preserve">Agents must not run a dealer conversation.</w:t>
+      </w:r>
+      <w:r>
+        <w:t xml:space="preserve"> </w:t>
+      </w:r>
+      <w:r>
+        <w:t xml:space="preserve">Terms, territory and registration are Scott’s, the same as white-label, distribution and the facility referral arrangement above. An agent may explain that the program exists and hand off. Nothing below is a negotiating position.</w:t>
+      </w:r>
+    </w:p>
+    <w:p>
+      <w:pPr>
+        <w:pStyle w:val="BodyText"/>
+      </w:pPr>
+      <w:r>
+        <w:rPr>
+          <w:b/>
+          <w:bCs/>
+        </w:rPr>
+        <w:t xml:space="preserve">What it is.</w:t>
+      </w:r>
+      <w:r>
+        <w:t xml:space="preserve"> </w:t>
+      </w:r>
+      <w:r>
+        <w:t xml:space="preserve">Dealers resell the</w:t>
+      </w:r>
+      <w:r>
+        <w:t xml:space="preserve"> </w:t>
+      </w:r>
+      <w:r>
+        <w:rPr>
+          <w:b/>
+          <w:bCs/>
+        </w:rPr>
+        <w:t xml:space="preserve">$8,950 commercial unit</w:t>
+      </w:r>
+      <w:r>
+        <w:t xml:space="preserve"> </w:t>
+      </w:r>
+      <w:r>
+        <w:t xml:space="preserve">and earn a commission on the final sale price. This is</w:t>
+      </w:r>
+      <w:r>
+        <w:t xml:space="preserve"> </w:t>
+      </w:r>
+      <w:r>
+        <w:rPr>
+          <w:b/>
+          <w:bCs/>
+        </w:rPr>
+        <w:t xml:space="preserve">not</w:t>
+      </w:r>
+      <w:r>
+        <w:t xml:space="preserve"> </w:t>
+      </w:r>
+      <w:r>
+        <w:t xml:space="preserve">the facility referral arrangement in section 14, which pays $600 on a $2,995 consumer unit that the member buys directly from Enyrgy. Different product, different terms, different people. Never describe the two in the same breath to a prospect.</w:t>
+      </w:r>
+    </w:p>
+    <w:p>
+      <w:pPr>
+        <w:pStyle w:val="BodyText"/>
+      </w:pPr>
+      <w:r>
+        <w:rPr>
+          <w:b/>
+          <w:bCs/>
+        </w:rPr>
+        <w:t xml:space="preserve">Not US-only.</w:t>
+      </w:r>
+      <w:r>
+        <w:t xml:space="preserve"> </w:t>
+      </w:r>
+      <w:r>
+        <w:t xml:space="preserve">Commission is calculated on the actual sale price expressed in</w:t>
+      </w:r>
+      <w:r>
+        <w:t xml:space="preserve"> </w:t>
+      </w:r>
+      <w:r>
+        <w:rPr>
+          <w:b/>
+          <w:bCs/>
+        </w:rPr>
+        <w:t xml:space="preserve">USD</w:t>
+      </w:r>
+      <w:r>
+        <w:t xml:space="preserve">, whatever the dealer’s local currency.</w:t>
+      </w:r>
+    </w:p>
+    <w:p>
+      <w:pPr>
+        <w:pStyle w:val="BodyText"/>
+      </w:pPr>
+      <w:r>
+        <w:rPr>
+          <w:b/>
+          <w:bCs/>
+        </w:rPr>
+        <w:t xml:space="preserve">The commission ladder, tied to the final sale price:</w:t>
+      </w:r>
+    </w:p>
+    <w:tbl>
+      <w:tblPr>
+        <w:tblStyle w:val="Table"/>
+        <w:tblW w:type="auto" w:w="0"/>
+        <w:tblLook w:firstRow="1" w:lastRow="0" w:firstColumn="0" w:lastColumn="0" w:noHBand="0" w:noVBand="0" w:val="0020"/>
+      </w:tblPr>
+      <w:tblGrid>
+        <w:gridCol w:w="2640"/>
+        <w:gridCol w:w="2640"/>
+        <w:gridCol w:w="2640"/>
+      </w:tblGrid>
+      <w:tr>
+        <w:trPr>
+          <w:tblHeader w:val="on"/>
+        </w:trPr>
+        <w:tc>
+          <w:tcPr/>
+          <w:p>
+            <w:pPr>
+              <w:pStyle w:val="Compact"/>
+            </w:pPr>
+            <w:r>
+              <w:t xml:space="preserve">Commission</w:t>
+            </w:r>
+          </w:p>
+        </w:tc>
+        <w:tc>
+          <w:tcPr/>
+          <w:p>
+            <w:pPr>
+              <w:pStyle w:val="Compact"/>
+            </w:pPr>
+            <w:r>
+              <w:t xml:space="preserve">Maximum discount off MSRP</w:t>
+            </w:r>
+          </w:p>
+        </w:tc>
+        <w:tc>
+          <w:tcPr/>
+          <w:p>
+            <w:pPr>
+              <w:pStyle w:val="Compact"/>
+            </w:pPr>
+            <w:r>
+              <w:t xml:space="preserve">Resulting price</w:t>
+            </w:r>
+          </w:p>
+        </w:tc>
+      </w:tr>
+      <w:tr>
+        <w:tc>
+          <w:tcPr/>
+          <w:p>
+            <w:pPr>
+              <w:pStyle w:val="Compact"/>
+            </w:pPr>
+            <w:r>
+              <w:t xml:space="preserve">25 percent</w:t>
+            </w:r>
+          </w:p>
+        </w:tc>
+        <w:tc>
+          <w:tcPr/>
+          <w:p>
+            <w:pPr>
+              <w:pStyle w:val="Compact"/>
+            </w:pPr>
+            <w:r>
+              <w:t xml:space="preserve">none, sells at MSRP</w:t>
+            </w:r>
+          </w:p>
+        </w:tc>
+        <w:tc>
+          <w:tcPr/>
+          <w:p>
+            <w:pPr>
+              <w:pStyle w:val="Compact"/>
+            </w:pPr>
+            <w:r>
+              <w:t xml:space="preserve">$8,950</w:t>
+            </w:r>
+          </w:p>
+        </w:tc>
+      </w:tr>
+      <w:tr>
+        <w:tc>
+          <w:tcPr/>
+          <w:p>
+            <w:pPr>
+              <w:pStyle w:val="Compact"/>
+            </w:pPr>
+            <w:r>
+              <w:t xml:space="preserve">20 percent</w:t>
+            </w:r>
+          </w:p>
+        </w:tc>
+        <w:tc>
+          <w:tcPr/>
+          <w:p>
+            <w:pPr>
+              <w:pStyle w:val="Compact"/>
+            </w:pPr>
+            <w:r>
+              <w:t xml:space="preserve">$1,342.50</w:t>
+            </w:r>
+          </w:p>
+        </w:tc>
+        <w:tc>
+          <w:tcPr/>
+          <w:p>
+            <w:pPr>
+              <w:pStyle w:val="Compact"/>
+            </w:pPr>
+            <w:r>
+              <w:t xml:space="preserve">$7,607.50</w:t>
+            </w:r>
+          </w:p>
+        </w:tc>
+      </w:tr>
+      <w:tr>
+        <w:tc>
+          <w:tcPr/>
+          <w:p>
+            <w:pPr>
+              <w:pStyle w:val="Compact"/>
+            </w:pPr>
+            <w:r>
+              <w:t xml:space="preserve">16 percent</w:t>
+            </w:r>
+          </w:p>
+        </w:tc>
+        <w:tc>
+          <w:tcPr/>
+          <w:p>
+            <w:pPr>
+              <w:pStyle w:val="Compact"/>
+            </w:pPr>
+            <w:r>
+              <w:t xml:space="preserve">$1,790.00</w:t>
+            </w:r>
+          </w:p>
+        </w:tc>
+        <w:tc>
+          <w:tcPr/>
+          <w:p>
+            <w:pPr>
+              <w:pStyle w:val="Compact"/>
+            </w:pPr>
+            <w:r>
+              <w:t xml:space="preserve">$7,160.00</w:t>
+            </w:r>
+          </w:p>
+        </w:tc>
+      </w:tr>
+    </w:tbl>
+    <w:p>
+      <w:pPr>
+        <w:pStyle w:val="BodyText"/>
+      </w:pPr>
+      <w:r>
+        <w:rPr>
+          <w:b/>
+          <w:bCs/>
+        </w:rPr>
+        <w:t xml:space="preserve">$7,160 is the MAP floor.</w:t>
+      </w:r>
+      <w:r>
+        <w:t xml:space="preserve"> </w:t>
+      </w:r>
+      <w:r>
+        <w:t xml:space="preserve">A deal below it is flagged and pays no commission at all. The dealer discounts against their own commission, which is the point of the structure: they can compete on price, but only with their own margin.</w:t>
+      </w:r>
+    </w:p>
+    <w:p>
+      <w:pPr>
+        <w:pStyle w:val="BodyText"/>
+      </w:pPr>
+      <w:r>
+        <w:rPr>
+          <w:b/>
+          <w:bCs/>
+        </w:rPr>
+        <w:t xml:space="preserve">Deal registration.</w:t>
+      </w:r>
+      <w:r>
+        <w:t xml:space="preserve"> </w:t>
+      </w:r>
+      <w:r>
+        <w:t xml:space="preserve">A dealer registers a named facility and holds attribution on it for</w:t>
+      </w:r>
+      <w:r>
+        <w:t xml:space="preserve"> </w:t>
+      </w:r>
+      <w:r>
+        <w:rPr>
+          <w:b/>
+          <w:bCs/>
+        </w:rPr>
+        <w:t xml:space="preserve">90 days</w:t>
+      </w:r>
+      <w:r>
+        <w:t xml:space="preserve">. Registration runs through a form unique to that dealer, tracked as an Opportunity in the Commercial B2B pipeline. Build detail lives in the Implementation Guide section 12 and</w:t>
+      </w:r>
+      <w:r>
+        <w:t xml:space="preserve"> </w:t>
+      </w:r>
+      <w:r>
+        <w:rPr>
+          <w:rStyle w:val="VerbatimChar"/>
+        </w:rPr>
+        <w:t xml:space="preserve">campaigns/dealer-onboarding.md</w:t>
+      </w:r>
+      <w:r>
+        <w:t xml:space="preserve">; agents need only know that registration exists, that it expires, and that the roster of other dealers is confidential.</w:t>
+      </w:r>
+    </w:p>
+    <w:p>
+      <w:pPr>
+        <w:pStyle w:val="BodyText"/>
+      </w:pPr>
+      <w:r>
+        <w:rPr>
+          <w:b/>
+          <w:bCs/>
+        </w:rPr>
+        <w:t xml:space="preserve">Never disclose the dealer roster.</w:t>
+      </w:r>
+      <w:r>
+        <w:t xml:space="preserve"> </w:t>
+      </w:r>
+      <w:r>
+        <w:t xml:space="preserve">Who else sells for Enyrgy, and by inference which territories are covered and how large the network is, is competitive intelligence. Each dealer sees only their own name on their own form, deliberately.</w:t>
+      </w:r>
+    </w:p>
+    <w:bookmarkEnd w:id="24"/>
+    <w:bookmarkStart w:id="25" w:name="key-reference-facts-quick-lookup"/>
     <w:p>
       <w:pPr>
         <w:pStyle w:val="Heading2"/>
@@ -2861,7 +3216,7 @@
               <w:pStyle w:val="Compact"/>
             </w:pPr>
             <w:r>
-              <w:t xml:space="preserve">Customers</w:t>
+              <w:t xml:space="preserve">Users</w:t>
             </w:r>
           </w:p>
         </w:tc>
@@ -2872,7 +3227,17 @@
               <w:pStyle w:val="Compact"/>
             </w:pPr>
             <w:r>
-              <w:t xml:space="preserve">600+ across 5 countries</w:t>
+              <w:t xml:space="preserve">600+ across 5 countries (</w:t>
+            </w:r>
+            <w:r>
+              <w:rPr>
+                <w:b/>
+                <w:bCs/>
+              </w:rPr>
+              <w:t xml:space="preserve">say users, not customers</w:t>
+            </w:r>
+            <w:r>
+              <w:t xml:space="preserve">)</w:t>
             </w:r>
           </w:p>
         </w:tc>
@@ -3077,6 +3442,54 @@
               <w:pStyle w:val="Compact"/>
             </w:pPr>
             <w:r>
+              <w:t xml:space="preserve">Dealer commission</w:t>
+            </w:r>
+          </w:p>
+        </w:tc>
+        <w:tc>
+          <w:tcPr/>
+          <w:p>
+            <w:pPr>
+              <w:pStyle w:val="Compact"/>
+            </w:pPr>
+            <w:r>
+              <w:t xml:space="preserve">25 / 20 / 16 percent on final sale price, MAP floor $7,160 (section 14b)</w:t>
+            </w:r>
+          </w:p>
+        </w:tc>
+      </w:tr>
+      <w:tr>
+        <w:tc>
+          <w:tcPr/>
+          <w:p>
+            <w:pPr>
+              <w:pStyle w:val="Compact"/>
+            </w:pPr>
+            <w:r>
+              <w:t xml:space="preserve">Facility referral</w:t>
+            </w:r>
+          </w:p>
+        </w:tc>
+        <w:tc>
+          <w:tcPr/>
+          <w:p>
+            <w:pPr>
+              <w:pStyle w:val="Compact"/>
+            </w:pPr>
+            <w:r>
+              <w:t xml:space="preserve">$600 per Consumer Unit sale (section 14, escalate to Scott)</w:t>
+            </w:r>
+          </w:p>
+        </w:tc>
+      </w:tr>
+      <w:tr>
+        <w:tc>
+          <w:tcPr/>
+          <w:p>
+            <w:pPr>
+              <w:pStyle w:val="Compact"/>
+            </w:pPr>
+            <w:r>
               <w:t xml:space="preserve">Commercial model</w:t>
             </w:r>
           </w:p>
@@ -3094,8 +3507,8 @@
         </w:tc>
       </w:tr>
     </w:tbl>
-    <w:bookmarkEnd w:id="24"/>
-    <w:bookmarkStart w:id="32" w:name="X3c8fab249a12745cd8b0fe4a60814613a930d17"/>
+    <w:bookmarkEnd w:id="25"/>
+    <w:bookmarkStart w:id="33" w:name="X3c8fab249a12745cd8b0fe4a60814613a930d17"/>
     <w:p>
       <w:pPr>
         <w:pStyle w:val="Heading2"/>
@@ -3122,7 +3535,7 @@
         <w:t xml:space="preserve">This is a safety disclosure, not marketing copy. Reproduce it as written. No agent may shorten it, soften it, restate it in its own words, add to it, or reason from it to a condition it does not name.</w:t>
       </w:r>
     </w:p>
-    <w:bookmarkStart w:id="25" w:name="the-list-verbatim"/>
+    <w:bookmarkStart w:id="26" w:name="the-list-verbatim"/>
     <w:p>
       <w:pPr>
         <w:pStyle w:val="Heading3"/>
@@ -3243,8 +3656,8 @@
         <w:t xml:space="preserve">The age minimum of 18 (section 9) applies on top of this list.</w:t>
       </w:r>
     </w:p>
-    <w:bookmarkEnd w:id="25"/>
-    <w:bookmarkStart w:id="26" w:name="Xfe5b76f7bdef9e74f6fe2238bfb78b1a0b0085c"/>
+    <w:bookmarkEnd w:id="26"/>
+    <w:bookmarkStart w:id="27" w:name="Xfe5b76f7bdef9e74f6fe2238bfb78b1a0b0085c"/>
     <w:p>
       <w:pPr>
         <w:pStyle w:val="Heading3"/>
@@ -3313,8 +3726,8 @@
         <w:t xml:space="preserve">Send it as written or do not send it. This is the only standing exemption to section 11.</w:t>
       </w:r>
     </w:p>
-    <w:bookmarkEnd w:id="26"/>
-    <w:bookmarkStart w:id="27" w:name="X7079cd488be367803663fc3ca74e1a7445ddb0b"/>
+    <w:bookmarkEnd w:id="27"/>
+    <w:bookmarkStart w:id="28" w:name="X7079cd488be367803663fc3ca74e1a7445ddb0b"/>
     <w:p>
       <w:pPr>
         <w:pStyle w:val="Heading3"/>
@@ -3421,8 +3834,8 @@
         <w:t xml:space="preserve">is not the same as clear. That timing question also belongs to their physician, not to us.</w:t>
       </w:r>
     </w:p>
-    <w:bookmarkEnd w:id="27"/>
-    <w:bookmarkStart w:id="28" w:name="Xac8e472bf725badfd76b7f636b4a5d32aa584fa"/>
+    <w:bookmarkEnd w:id="28"/>
+    <w:bookmarkStart w:id="29" w:name="Xac8e472bf725badfd76b7f636b4a5d32aa584fa"/>
     <w:p>
       <w:pPr>
         <w:pStyle w:val="Heading3"/>
@@ -3608,8 +4021,8 @@
         <w:t xml:space="preserve">The honest position, and the one to hold: we do not know whether it helps or harms in a specific medical situation, the questions that would settle it are answerable by their physician in a few minutes, and pointing them there is a better answer than yes.</w:t>
       </w:r>
     </w:p>
-    <w:bookmarkEnd w:id="28"/>
-    <w:bookmarkStart w:id="29" w:name="X3883c1d2206e10653c9889d2dfe957a08beb348"/>
+    <w:bookmarkEnd w:id="29"/>
+    <w:bookmarkStart w:id="30" w:name="X3883c1d2206e10653c9889d2dfe957a08beb348"/>
     <w:p>
       <w:pPr>
         <w:pStyle w:val="Heading3"/>
@@ -3696,8 +4109,8 @@
         <w:t xml:space="preserve">The platform opens three pathways instead of one and is far more efficient at the vitamin D pathway, and that is the accurate comparison. It does not make vitamin D genetics irrelevant.</w:t>
       </w:r>
     </w:p>
-    <w:bookmarkEnd w:id="29"/>
-    <w:bookmarkStart w:id="30" w:name="use-on-intact-skin-only"/>
+    <w:bookmarkEnd w:id="30"/>
+    <w:bookmarkStart w:id="31" w:name="use-on-intact-skin-only"/>
     <w:p>
       <w:pPr>
         <w:pStyle w:val="Heading3"/>
@@ -3772,8 +4185,8 @@
         <w:t xml:space="preserve">Do not suggest that a session supports a specific injury, do not answer a wound question with the bone and recovery research, and do not describe where to position anything. The line above, then the physician, then stop.</w:t>
       </w:r>
     </w:p>
-    <w:bookmarkEnd w:id="30"/>
-    <w:bookmarkStart w:id="31" w:name="why-the-pacemaker-line-was-removed"/>
+    <w:bookmarkEnd w:id="31"/>
+    <w:bookmarkStart w:id="32" w:name="why-the-pacemaker-line-was-removed"/>
     <w:p>
       <w:pPr>
         <w:pStyle w:val="Heading3"/>
@@ -3921,9 +4334,9 @@
         <w:t xml:space="preserve">CONFIDENTIAL - Enyrgy Inc - 5115 N 27th Ave, Bld 66, Phoenix, AZ 85017 - enyrgy.com - Sunlight. Evolved.</w:t>
       </w:r>
     </w:p>
-    <w:bookmarkEnd w:id="31"/>
     <w:bookmarkEnd w:id="32"/>
     <w:bookmarkEnd w:id="33"/>
+    <w:bookmarkEnd w:id="34"/>
     <w:sectPr>
       <w:footnotePr>
         <w:numRestart w:val="eachSect"/>

</xml_diff>

<commit_message>
KB: remove the CNM deal terms entirely
Scott's call, and the better one. I had recorded the bespoke pricing as a
labelled exception to stop it propagating. Keeping it out of an agent-read file
achieves that more simply: an agent cannot quote terms it has never seen, and a
label only works if whoever reads it also reads the label.

CNM is a one-off proposal to a medical-grade facility treating mostly cancer
patients, in a very affluent market, and is not the primary target profile. The
standard answers are untouched and are now the only answers in the KB: $49 to
$125 monthly for operators, $600 per device on resale.

The terms are not lost. They live in Enyrgy_Facility_Overview.md, which is
version-controlled and is the proposal itself, which is the correct home for
deal-specific numbers.

Co-Authored-By: Claude Opus 5 <noreply@anthropic.com>
</commit_message>
<xml_diff>
--- a/Enyrgy_Paperclip_Knowledge_Base.docx
+++ b/Enyrgy_Paperclip_Knowledge_Base.docx
@@ -683,80 +683,6 @@
       </w:pPr>
       <w:r>
         <w:t xml:space="preserve">OEM white-label (Lumanova / Luma D Light): same MSRP, wholesale arrangement.</w:t>
-      </w:r>
-    </w:p>
-    <w:p>
-      <w:pPr>
-        <w:pStyle w:val="Compact"/>
-        <w:numPr>
-          <w:ilvl w:val="0"/>
-          <w:numId w:val="1003"/>
-        </w:numPr>
-      </w:pPr>
-      <w:r>
-        <w:rPr>
-          <w:b/>
-          <w:bCs/>
-        </w:rPr>
-        <w:t xml:space="preserve">Center for New Medicine, bespoke terms. NOT general pricing, do not propagate (agreed August 2026).</w:t>
-      </w:r>
-      <w:r>
-        <w:t xml:space="preserve"> </w:t>
-      </w:r>
-      <w:r>
-        <w:t xml:space="preserve">CNM is a medical-grade facility and its proposal carries two terms that exist nowhere else: the modality priced at</w:t>
-      </w:r>
-      <w:r>
-        <w:t xml:space="preserve"> </w:t>
-      </w:r>
-      <w:r>
-        <w:rPr>
-          <w:b/>
-          <w:bCs/>
-        </w:rPr>
-        <w:t xml:space="preserve">$25 a session or $100 a week</w:t>
-      </w:r>
-      <w:r>
-        <w:t xml:space="preserve">, and a</w:t>
-      </w:r>
-      <w:r>
-        <w:t xml:space="preserve"> </w:t>
-      </w:r>
-      <w:r>
-        <w:rPr>
-          <w:b/>
-          <w:bCs/>
-        </w:rPr>
-        <w:t xml:space="preserve">50/50 revenue share on consumer units, roughly $1,500 per unit</w:t>
-      </w:r>
-      <w:r>
-        <w:t xml:space="preserve">, with no inventory held by the facility.</w:t>
-      </w:r>
-      <w:r>
-        <w:t xml:space="preserve"> </w:t>
-      </w:r>
-      <w:r>
-        <w:rPr>
-          <w:b/>
-          <w:bCs/>
-        </w:rPr>
-        <w:t xml:space="preserve">$100 a week is about $433 a month, roughly 3.5x the top of the standard operator range below, and the 50/50 share is 2.5x the standard $600.</w:t>
-      </w:r>
-      <w:r>
-        <w:t xml:space="preserve"> </w:t>
-      </w:r>
-      <w:r>
-        <w:t xml:space="preserve">Both are one-off terms for a flagship account. When any other facility asks what operators charge, the answer is the $49 to $125 monthly range; when any other facility asks about reselling, the answer is the $600 figure.</w:t>
-      </w:r>
-      <w:r>
-        <w:t xml:space="preserve"> </w:t>
-      </w:r>
-      <w:r>
-        <w:rPr>
-          <w:b/>
-          <w:bCs/>
-        </w:rPr>
-        <w:t xml:space="preserve">A special deal becomes the standard the moment someone reads it as one.</w:t>
       </w:r>
     </w:p>
     <w:p>

</xml_diff>